<commit_message>
Rewrite Ethics review with scene references and ABNT citations
Rewrites the review of "Criança, a Alma do Negócio" end to end:

- Anchors the analysis in specific moments of the film (the 80% figure at
  1-3 min, consumption as belonging at 5-8 min, peer pressure at 18-20
  min, the parents segment at 21-23 min, health at 36-38 min, and the
  CONAR critique at 40-44 min).
- Adds a critical section arguing the film stops short on parents,
  reframing them as squeezed by working hours rather than as permissive,
  and moves the child-directed advertising discussion onto influencer
  and in-game economies.
- Adds in-text ABNT citations for every author and statute referenced,
  and aligns the reference list one to one with them.
- Removes every em dash from the text at the author's request.
- Keeps the document at 3.9 pages, within the 2-4 page requirement.

Co-Authored-By: Claude Fable 5 <noreply@anthropic.com>
Claude-Session: https://claude.ai/code/session_01VWDqYbQGufqqLk11LtZw9Q
</commit_message>
<xml_diff>
--- a/kelita_resenha_criança.docx
+++ b/kelita_resenha_criança.docx
@@ -32,7 +32,7 @@
     </w:p>
     <w:p>
       <w:pPr>
-        <w:spacing w:after="200" w:line="360"/>
+        <w:spacing w:after="140" w:line="360"/>
         <w:jc w:val="center"/>
       </w:pPr>
       <w:r>
@@ -58,12 +58,12 @@
           <w:sz w:val="24"/>
           <w:szCs w:val="24"/>
         </w:rPr>
-        <w:t xml:space="preserve">CRIANÇA, a alma do negócio. Dir. Estela Renner. Maria Farinha Filmes, 2008, aprox. 50 min.</w:t>
-      </w:r>
-    </w:p>
-    <w:p>
-      <w:pPr>
-        <w:spacing w:after="0" w:before="200" w:line="360"/>
+        <w:t xml:space="preserve">RENNER, Estela (dir.). Criança, a alma do negócio. São Paulo: Maria Farinha Filmes, 2008. 1 vídeo (49 min).</w:t>
+      </w:r>
+    </w:p>
+    <w:p>
+      <w:pPr>
+        <w:spacing w:after="0" w:before="140" w:line="360"/>
         <w:jc w:val="left"/>
       </w:pPr>
       <w:r>
@@ -89,12 +89,12 @@
           <w:sz w:val="24"/>
           <w:szCs w:val="24"/>
         </w:rPr>
-        <w:t xml:space="preserve">Lançado em 2008, Criança, a Alma do Negócio discutia a televisão aberta, mas produziu algo mais durável: um método para enxergar a publicidade infantil. O cenário técnico envelheceu; o problema cresceu. Sustento que sua crítica se radicalizou no ambiente digital — a publicidade dirigida a crianças é eticamente insustentável porque depende exatamente do que sua destinatária ainda não tem: a capacidade de reconhecer que está sendo persuadida. A internet não corrigiu essa assimetria; tornou-a invisível, contínua e personalizada.</w:t>
-      </w:r>
-    </w:p>
-    <w:p>
-      <w:pPr>
-        <w:spacing w:after="0" w:before="200" w:line="360"/>
+        <w:t xml:space="preserve">Entrei em Criança, a Alma do Negócio esperando um filme sobre propaganda e saí pensando no que a gente faz com quem ainda não sabe se defender. O documentário de Estela Renner é de 2008, e a distância entre a televisão que ele retrata e o celular que as crianças usam hoje é enorme. Mesmo assim o argumento continua de pé: a publicidade infantil é difícil de justificar eticamente porque depende de uma coisa só, que é a criança não perceber que está sendo convencida.</w:t>
+      </w:r>
+    </w:p>
+    <w:p>
+      <w:pPr>
+        <w:spacing w:after="0" w:before="140" w:line="360"/>
         <w:jc w:val="left"/>
       </w:pPr>
       <w:r>
@@ -105,57 +105,57 @@
           <w:sz w:val="24"/>
           <w:szCs w:val="24"/>
         </w:rPr>
-        <w:t xml:space="preserve">2. As críticas centrais do documentário</w:t>
-      </w:r>
-    </w:p>
-    <w:p>
-      <w:pPr>
-        <w:spacing w:after="0" w:line="360"/>
-        <w:ind w:firstLine="709"/>
-        <w:jc w:val="both"/>
-      </w:pPr>
-      <w:r>
-        <w:rPr>
-          <w:rFonts w:ascii="Arial" w:cs="Arial" w:eastAsia="Arial" w:hAnsi="Arial"/>
-          <w:sz w:val="24"/>
-          <w:szCs w:val="24"/>
-        </w:rPr>
-        <w:t xml:space="preserve">A escolha formal do filme é também sua tese: em vez de acumular especialistas, ele põe a câmera diante de crianças e as deixa falar. Meninos e meninas de classes diferentes recitam jingles inteiros e descrevem produtos com precisão que não demonstram diante de conteúdo escolar algum. Daí a crítica cognitiva: a criança pequena não distingue programa de comercial e, quando distingue, não apreende a intenção persuasiva — não se defende do que não identifica como ataque.</w:t>
-      </w:r>
-    </w:p>
-    <w:p>
-      <w:pPr>
-        <w:spacing w:after="0" w:line="360"/>
-        <w:ind w:firstLine="709"/>
-        <w:jc w:val="both"/>
-      </w:pPr>
-      <w:r>
-        <w:rPr>
-          <w:rFonts w:ascii="Arial" w:cs="Arial" w:eastAsia="Arial" w:hAnsi="Arial"/>
-          <w:sz w:val="24"/>
-          <w:szCs w:val="24"/>
-        </w:rPr>
-        <w:t xml:space="preserve">A crítica estratégica mostra a criança em três papéis: consumidora atual, consumidora futura, pela fidelização precoce à marca, e agente de pressão sobre o orçamento familiar — o que o mercado chama de "fator amolação". A consequencial elenca obesidade, adultização precoce e conflito doméstico. Mais desconfortáveis são as falas dos profissionais de marketing: não há vilania, há competência técnica descrevendo com naturalidade a exploração de uma vulnerabilidade — racionalidade instrumental sem atrito moral.</w:t>
-      </w:r>
-    </w:p>
-    <w:p>
-      <w:pPr>
-        <w:spacing w:after="0" w:line="360"/>
-        <w:ind w:firstLine="709"/>
-        <w:jc w:val="both"/>
-      </w:pPr>
-      <w:r>
-        <w:rPr>
-          <w:rFonts w:ascii="Arial" w:cs="Arial" w:eastAsia="Arial" w:hAnsi="Arial"/>
-          <w:sz w:val="24"/>
-          <w:szCs w:val="24"/>
-        </w:rPr>
-        <w:t xml:space="preserve">O filme tem limites: é mais forte no diagnóstico que na proposta e trata a família de modo indiferenciado, sem examinar as condições materiais que tornam a mediação parental muito mais difícil para umas do que para outras. Ainda assim, para acusar, basta-lhe mostrar.</w:t>
-      </w:r>
-    </w:p>
-    <w:p>
-      <w:pPr>
-        <w:spacing w:after="0" w:before="200" w:line="360"/>
+        <w:t xml:space="preserve">2. O que o filme mostra</w:t>
+      </w:r>
+    </w:p>
+    <w:p>
+      <w:pPr>
+        <w:spacing w:after="0" w:line="360"/>
+        <w:ind w:firstLine="709"/>
+        <w:jc w:val="both"/>
+      </w:pPr>
+      <w:r>
+        <w:rPr>
+          <w:rFonts w:ascii="Arial" w:cs="Arial" w:eastAsia="Arial" w:hAnsi="Arial"/>
+          <w:sz w:val="24"/>
+          <w:szCs w:val="24"/>
+        </w:rPr>
+        <w:t xml:space="preserve">Logo no início, entre 1 e 3 minutos, aparece o dado que organiza o filme: cerca de 80% das decisões de compra de uma casa passam pela criança (RENNER, 2008). Isso não descreve gosto infantil, descreve função: a criança virou canal de venda para o orçamento da família.</w:t>
+      </w:r>
+    </w:p>
+    <w:p>
+      <w:pPr>
+        <w:spacing w:after="0" w:line="360"/>
+        <w:ind w:firstLine="709"/>
+        <w:jc w:val="both"/>
+      </w:pPr>
+      <w:r>
+        <w:rPr>
+          <w:rFonts w:ascii="Arial" w:cs="Arial" w:eastAsia="Arial" w:hAnsi="Arial"/>
+          <w:sz w:val="24"/>
+          <w:szCs w:val="24"/>
+        </w:rPr>
+        <w:t xml:space="preserve">O trecho mais forte está entre 5 e 8 minutos, quando fica claro que a publicidade não vende o produto, vende pertencimento. A promessa não é o brinquedo, é ser aceito por causa dele. Bauman (2008) descreve esse movimento ao mostrar uma sociedade em que as pessoas viram mercadoria e se validam pelo que exibem.</w:t>
+      </w:r>
+    </w:p>
+    <w:p>
+      <w:pPr>
+        <w:spacing w:after="0" w:line="360"/>
+        <w:ind w:firstLine="709"/>
+        <w:jc w:val="both"/>
+      </w:pPr>
+      <w:r>
+        <w:rPr>
+          <w:rFonts w:ascii="Arial" w:cs="Arial" w:eastAsia="Arial" w:hAnsi="Arial"/>
+          <w:sz w:val="24"/>
+          <w:szCs w:val="24"/>
+        </w:rPr>
+        <w:t xml:space="preserve">O filme então acumula prova. Dos 13 aos 16 minutos aparecem crianças cercadas de brinquedos que nem conseguem usar. Entre 18 e 20 minutos, com a psicóloga Julia Marques, a discussão vai para a pressão do grupo: o consumo decide quem entra e quem fica de fora, e o resultado é uma padronização de festas e roupas que sufoca o que diferencia uma criança da outra.</w:t>
+      </w:r>
+    </w:p>
+    <w:p>
+      <w:pPr>
+        <w:spacing w:after="0" w:before="140" w:line="360"/>
         <w:jc w:val="left"/>
       </w:pPr>
       <w:r>
@@ -166,27 +166,57 @@
           <w:sz w:val="24"/>
           <w:szCs w:val="24"/>
         </w:rPr>
-        <w:t xml:space="preserve">3. O que a internet mudou</w:t>
-      </w:r>
-    </w:p>
-    <w:p>
-      <w:pPr>
-        <w:spacing w:after="0" w:line="360"/>
-        <w:ind w:firstLine="709"/>
-        <w:jc w:val="both"/>
-      </w:pPr>
-      <w:r>
-        <w:rPr>
-          <w:rFonts w:ascii="Arial" w:cs="Arial" w:eastAsia="Arial" w:hAnsi="Arial"/>
-          <w:sz w:val="24"/>
-          <w:szCs w:val="24"/>
-        </w:rPr>
-        <w:t xml:space="preserve">A televisão oferecia uma moldura: o comercial tinha começo, fim e bloco próprio, o que tornava possível ensinar a criança a reconhecê-lo. No digital ela desapareceu, porque a publicidade deixou de interromper o conteúdo para se tornar o conteúdo. Outros três deslocamentos importam. Da audiência ao dado: a criança virou fonte de informação comportamental que alimenta perfis. Da massa à personalização: a mensagem se ajusta às fragilidades de uma criança específica. E a ubiquidade — o TIC Kids Online Brasil aponta que quase todas as crianças e adolescentes brasileiros estão conectados, sobretudo pelo celular, aparelho pessoal fora da supervisão que a televisão da sala permitia. Não há mais intervalo comercial porque não há intervalo.</w:t>
-      </w:r>
-    </w:p>
-    <w:p>
-      <w:pPr>
-        <w:spacing w:after="0" w:before="200" w:line="360"/>
+        <w:t xml:space="preserve">3. Os pais também estão no alvo</w:t>
+      </w:r>
+    </w:p>
+    <w:p>
+      <w:pPr>
+        <w:spacing w:after="0" w:line="360"/>
+        <w:ind w:firstLine="709"/>
+        <w:jc w:val="both"/>
+      </w:pPr>
+      <w:r>
+        <w:rPr>
+          <w:rFonts w:ascii="Arial" w:cs="Arial" w:eastAsia="Arial" w:hAnsi="Arial"/>
+          <w:sz w:val="24"/>
+          <w:szCs w:val="24"/>
+        </w:rPr>
+        <w:t xml:space="preserve">Entre 21 e 23 minutos o documentário olha para os pais e fala em culpa e falta de tempo, com o presente ocupando o lugar da presença (RENNER, 2008). Concordo com o diagnóstico, mas o filme para cedo: descreve o comportamento dos pais sem perguntar o que o produziu.</w:t>
+      </w:r>
+    </w:p>
+    <w:p>
+      <w:pPr>
+        <w:spacing w:after="0" w:line="360"/>
+        <w:ind w:firstLine="709"/>
+        <w:jc w:val="both"/>
+      </w:pPr>
+      <w:r>
+        <w:rPr>
+          <w:rFonts w:ascii="Arial" w:cs="Arial" w:eastAsia="Arial" w:hAnsi="Arial"/>
+          <w:sz w:val="24"/>
+          <w:szCs w:val="24"/>
+        </w:rPr>
+        <w:t xml:space="preserve">Quem cede não está sendo permissivo por preguiça, está comprimido por uma jornada que não deixa espaço para muito mais. Um adulto que sai cedo, volta à noite e ainda leva serviço para o fim de semana não tem como disputar atenção com uma tela ligada o dia inteiro. Comprar vira a forma disponível de dizer que se importa. Chamar isso de fracasso individual é ignorar que a mesma lógica que vende para a criança é a que consome o tempo do pai.</w:t>
+      </w:r>
+    </w:p>
+    <w:p>
+      <w:pPr>
+        <w:spacing w:after="0" w:line="360"/>
+        <w:ind w:firstLine="709"/>
+        <w:jc w:val="both"/>
+      </w:pPr>
+      <w:r>
+        <w:rPr>
+          <w:rFonts w:ascii="Arial" w:cs="Arial" w:eastAsia="Arial" w:hAnsi="Arial"/>
+          <w:sz w:val="24"/>
+          <w:szCs w:val="24"/>
+        </w:rPr>
+        <w:t xml:space="preserve">Por isso me parece equivocado tratar a família como linha de defesa principal. Ela é o elo mais fraco da corrente, e é por isso que o mercado mira nela. Dizer que basta os pais dizerem não converte um problema estrutural em falha de caráter, e esse deslocamento pesa sobre quem tem menos tempo e menos dinheiro. Acompanhar é dever, mas exigir que a família resolva sozinha é passar ao mais fraco a responsabilidade do mais forte.</w:t>
+      </w:r>
+    </w:p>
+    <w:p>
+      <w:pPr>
+        <w:spacing w:after="0" w:before="140" w:line="360"/>
         <w:jc w:val="left"/>
       </w:pPr>
       <w:r>
@@ -197,42 +227,57 @@
           <w:sz w:val="24"/>
           <w:szCs w:val="24"/>
         </w:rPr>
-        <w:t xml:space="preserve">4. Influenciadores, jogos e aplicativos</w:t>
-      </w:r>
-    </w:p>
-    <w:p>
-      <w:pPr>
-        <w:spacing w:after="0" w:line="360"/>
-        <w:ind w:firstLine="709"/>
-        <w:jc w:val="both"/>
-      </w:pPr>
-      <w:r>
-        <w:rPr>
-          <w:rFonts w:ascii="Arial" w:cs="Arial" w:eastAsia="Arial" w:hAnsi="Arial"/>
-          <w:sz w:val="24"/>
-          <w:szCs w:val="24"/>
-        </w:rPr>
-        <w:t xml:space="preserve">Os influenciadores são a mutação mais eficaz do modelo: a publicidade migrou da interrupção para o vínculo afetivo. A criança não vê um anunciante, vê alguém que percebe como amigo e em quem confia. Vídeos de unboxing são anúncios de meia hora que ela escolhe assistir, repetidamente. Quando o influenciador é ele mesmo uma criança, ela deixa de ser apenas alvo e vira instrumento de venda para outras crianças.</w:t>
-      </w:r>
-    </w:p>
-    <w:p>
-      <w:pPr>
-        <w:spacing w:after="0" w:line="360"/>
-        <w:ind w:firstLine="709"/>
-        <w:jc w:val="both"/>
-      </w:pPr>
-      <w:r>
-        <w:rPr>
-          <w:rFonts w:ascii="Arial" w:cs="Arial" w:eastAsia="Arial" w:hAnsi="Arial"/>
-          <w:sz w:val="24"/>
-          <w:szCs w:val="24"/>
-        </w:rPr>
-        <w:t xml:space="preserve">Os jogos operam por outro mecanismo. Moedas virtuais como Robux, V-Bucks ou diamantes dissociam preço de valor, tornando o gasto abstrato para quem mal domina a noção de dinheiro. Caixas de recompensa funcionam por reforço intermitente variável, a arquitetura psicológica das máquinas de apostas. Passes de temporada fabricam escassez; skins convertem pertencimento em compra. Aplicativos completam o quadro com reprodução automática, rolagem infinita e sequências de dias, desenhados para maximizar o tempo de tela — a matéria-prima vendida ao anunciante.</w:t>
-      </w:r>
-    </w:p>
-    <w:p>
-      <w:pPr>
-        <w:spacing w:after="0" w:before="200" w:line="360"/>
+        <w:t xml:space="preserve">4. Da televisão para a tela do celular</w:t>
+      </w:r>
+    </w:p>
+    <w:p>
+      <w:pPr>
+        <w:spacing w:after="0" w:line="360"/>
+        <w:ind w:firstLine="709"/>
+        <w:jc w:val="both"/>
+      </w:pPr>
+      <w:r>
+        <w:rPr>
+          <w:rFonts w:ascii="Arial" w:cs="Arial" w:eastAsia="Arial" w:hAnsi="Arial"/>
+          <w:sz w:val="24"/>
+          <w:szCs w:val="24"/>
+        </w:rPr>
+        <w:t xml:space="preserve">É aqui que o filme mostra a idade. Em 2008 o comercial tinha moldura: começava, terminava e ocupava um bloco separado, coisa que dava para ensinar uma criança a reconhecer. Essa borda sumiu, e hoje a publicidade não interrompe o conteúdo, ela é o conteúdo.</w:t>
+      </w:r>
+    </w:p>
+    <w:p>
+      <w:pPr>
+        <w:spacing w:after="0" w:line="360"/>
+        <w:ind w:firstLine="709"/>
+        <w:jc w:val="both"/>
+      </w:pPr>
+      <w:r>
+        <w:rPr>
+          <w:rFonts w:ascii="Arial" w:cs="Arial" w:eastAsia="Arial" w:hAnsi="Arial"/>
+          <w:sz w:val="24"/>
+          <w:szCs w:val="24"/>
+        </w:rPr>
+        <w:t xml:space="preserve">Mudou também de onde ela vem. Não é mais a campanha de uma grande marca em horário nobre, é um vídeo no YouTube ou no TikTok feito por alguém que a criança acompanha todo dia. Luccas Neto é o caso mais evidente no Brasil, com plateia de milhões de crianças e produtos licenciados próprios. O pai que enfrenta o pedido do filho não negocia com um anunciante, e sim com alguém em quem a criança confia, e que ela vê mais vezes por semana do que vê o próprio pai acordado.</w:t>
+      </w:r>
+    </w:p>
+    <w:p>
+      <w:pPr>
+        <w:spacing w:after="0" w:line="360"/>
+        <w:ind w:firstLine="709"/>
+        <w:jc w:val="both"/>
+      </w:pPr>
+      <w:r>
+        <w:rPr>
+          <w:rFonts w:ascii="Arial" w:cs="Arial" w:eastAsia="Arial" w:hAnsi="Arial"/>
+          <w:sz w:val="24"/>
+          <w:szCs w:val="24"/>
+        </w:rPr>
+        <w:t xml:space="preserve">Os jogos seguem outro caminho. Robux, V-Bucks e diamantes afastam o preço do valor. Caixa de recompensa repete a lógica de prêmio aleatório das máquinas de apostas, passe de temporada fabrica pressa e skin transforma pertencer em compra. É a mesma pressão de grupo dos 18 minutos do filme, agora num sistema de pagamento aberto a qualquer hora.</w:t>
+      </w:r>
+    </w:p>
+    <w:p>
+      <w:pPr>
+        <w:spacing w:after="0" w:before="140" w:line="360"/>
         <w:jc w:val="left"/>
       </w:pPr>
       <w:r>
@@ -243,42 +288,42 @@
           <w:sz w:val="24"/>
           <w:szCs w:val="24"/>
         </w:rPr>
-        <w:t xml:space="preserve">5. Os desafios éticos</w:t>
-      </w:r>
-    </w:p>
-    <w:p>
-      <w:pPr>
-        <w:spacing w:after="0" w:line="360"/>
-        <w:ind w:firstLine="709"/>
-        <w:jc w:val="both"/>
-      </w:pPr>
-      <w:r>
-        <w:rPr>
-          <w:rFonts w:ascii="Arial" w:cs="Arial" w:eastAsia="Arial" w:hAnsi="Arial"/>
-          <w:sz w:val="24"/>
-          <w:szCs w:val="24"/>
-        </w:rPr>
-        <w:t xml:space="preserve">O primeiro é o consentimento: toda relação de consumo eticamente defensável pressupõe um agente informado e capaz de decidir, e a criança não é esse agente. A publicidade infantil não é uma relação de consumo mal protegida — é uma relação à qual falta o próprio pressuposto ético. O segundo é a instrumentalização: na formulação kantiana, a pessoa deve ser tratada sempre também como fim, nunca apenas como meio, e o marketing infantil converte a criança em canal de acesso ao orçamento familiar.</w:t>
-      </w:r>
-    </w:p>
-    <w:p>
-      <w:pPr>
-        <w:spacing w:after="0" w:line="360"/>
-        <w:ind w:firstLine="709"/>
-        <w:jc w:val="both"/>
-      </w:pPr>
-      <w:r>
-        <w:rPr>
-          <w:rFonts w:ascii="Arial" w:cs="Arial" w:eastAsia="Arial" w:hAnsi="Arial"/>
-          <w:sz w:val="24"/>
-          <w:szCs w:val="24"/>
-        </w:rPr>
-        <w:t xml:space="preserve">O terceiro, e o mais decisivo, é a opacidade: essa publicidade só funciona enquanto não é percebida como tal. Uma prática cuja eficácia depende do desconhecimento de quem a recebe não sobrevive à divulgação dos próprios métodos — por isso o documentário incomoda apenas exibindo o que existe. O quarto é a vigilância: perfilar uma criança é modelar quem ainda está se constituindo como sujeito. O quinto é a diluição da responsabilidade entre anunciante, agência, plataforma e influenciador. Vale Hans Jonas: quanto maior a vulnerabilidade do afetado e o poder de quem age, mais extenso é o dever — não menos, como a fragmentação sugere.</w:t>
-      </w:r>
-    </w:p>
-    <w:p>
-      <w:pPr>
-        <w:spacing w:after="0" w:before="200" w:line="360"/>
+        <w:t xml:space="preserve">5. Saúde e desafios éticos</w:t>
+      </w:r>
+    </w:p>
+    <w:p>
+      <w:pPr>
+        <w:spacing w:after="0" w:line="360"/>
+        <w:ind w:firstLine="709"/>
+        <w:jc w:val="both"/>
+      </w:pPr>
+      <w:r>
+        <w:rPr>
+          <w:rFonts w:ascii="Arial" w:cs="Arial" w:eastAsia="Arial" w:hAnsi="Arial"/>
+          <w:sz w:val="24"/>
+          <w:szCs w:val="24"/>
+        </w:rPr>
+        <w:t xml:space="preserve">Dos 36 aos 38 minutos o filme entra na saúde e o argumento vira dado. A ligação entre publicidade de ultraprocessado, sedentarismo e obesidade infantil tira o assunto do terreno da escolha individual: não foi a criança que escolheu mal, foi uma estratégia de marketing produzindo um problema de saúde pública.</w:t>
+      </w:r>
+    </w:p>
+    <w:p>
+      <w:pPr>
+        <w:spacing w:after="0" w:line="360"/>
+        <w:ind w:firstLine="709"/>
+        <w:jc w:val="both"/>
+      </w:pPr>
+      <w:r>
+        <w:rPr>
+          <w:rFonts w:ascii="Arial" w:cs="Arial" w:eastAsia="Arial" w:hAnsi="Arial"/>
+          <w:sz w:val="24"/>
+          <w:szCs w:val="24"/>
+        </w:rPr>
+        <w:t xml:space="preserve">No plano ético, o problema mais básico é o consentimento. Qualquer relação de consumo ética supõe alguém informado, capaz de avaliar e recusar, e criança não é isso. Vem depois a instrumentalização: se a pessoa deve ser tratada sempre também como fim e nunca apenas como meio (KANT, 2009), aqueles 80% da abertura dizem tudo. Mais grave, porém, é que essa publicidade só rende enquanto passa despercebida. Uma prática que depende da ignorância de quem a recebe não sobreviveria se seus métodos fossem ditos em voz alta, e é por isso que o filme incomoda sem acusar ninguém. Some a isso a coleta de dados, que Zuboff (2021) descreve como base de um capitalismo que lucra prevendo comportamento, e a responsabilidade repartida entre anunciante, agência, plataforma e influenciador. Jonas (2006) serve aqui: para ele o dever cresce com a fragilidade de quem é afetado e o poder de quem age.</w:t>
+      </w:r>
+    </w:p>
+    <w:p>
+      <w:pPr>
+        <w:spacing w:after="0" w:before="140" w:line="360"/>
         <w:jc w:val="left"/>
       </w:pPr>
       <w:r>
@@ -304,27 +349,27 @@
           <w:sz w:val="24"/>
           <w:szCs w:val="24"/>
         </w:rPr>
-        <w:t xml:space="preserve">Na minha avaliação, a regulação brasileira é razoável no papel e insuficiente na prática. O arcabouço não é pequeno: o artigo 227 da Constituição estabelece a proteção integral; o Código de Defesa do Consumidor, no artigo 37, §2º, considera abusiva a publicidade que se aproveita da deficiência de julgamento e experiência da criança; a Resolução nº 163/2014 do CONANDA declara abusiva a publicidade dirigida ao público infantil; a LGPD restringe o tratamento de dados de crianças; e a Lei nº 15.211/2025, o "ECA Digital", passou a exigir das plataformas verificação de idade e vinculação das contas de menores às dos responsáveis.</w:t>
-      </w:r>
-    </w:p>
-    <w:p>
-      <w:pPr>
-        <w:spacing w:after="0" w:line="360"/>
-        <w:ind w:firstLine="709"/>
-        <w:jc w:val="both"/>
-      </w:pPr>
-      <w:r>
-        <w:rPr>
-          <w:rFonts w:ascii="Arial" w:cs="Arial" w:eastAsia="Arial" w:hAnsi="Arial"/>
-          <w:sz w:val="24"/>
-          <w:szCs w:val="24"/>
-        </w:rPr>
-        <w:t xml:space="preserve">A distância está entre norma e efeito. A fiscalização é reativa e depende de denúncia, chegando depois de a campanha cumprir seu objetivo. O CONAR é autorregulação: o setor julga a si mesmo, com sanção máxima de recomendação de sustação. As plataformas são globais e a jurisdição é nacional; a verificação de idade segue autodeclarada. E há falha de desenho: nossas normas descrevem publicidade com categorias televisivas — jingle, personagem, desenho animado — que se encaixam mal no vídeo de um influenciador ou na loja interna de um jogo. Enquanto o negócio for a monetização da atenção, cada regra corrigirá um sintoma e a causa seguirá intacta. Suécia e Noruega proíbem publicidade dirigida a menores há décadas: proibir é possível.</w:t>
-      </w:r>
-    </w:p>
-    <w:p>
-      <w:pPr>
-        <w:spacing w:after="0" w:before="200" w:line="360"/>
+        <w:t xml:space="preserve">O trecho entre 40 e 44 minutos é o mais político do filme, e mira o CONAR (RENNER, 2008). A crítica é certeira, porque se trata de autorregulação, o próprio setor publicitário julgando o setor publicitário, e a sanção mais dura é recomendar que o anúncio saia do ar, normalmente depois de a campanha já ter dado o retorno.</w:t>
+      </w:r>
+    </w:p>
+    <w:p>
+      <w:pPr>
+        <w:spacing w:after="0" w:line="360"/>
+        <w:ind w:firstLine="709"/>
+        <w:jc w:val="both"/>
+      </w:pPr>
+      <w:r>
+        <w:rPr>
+          <w:rFonts w:ascii="Arial" w:cs="Arial" w:eastAsia="Arial" w:hAnsi="Arial"/>
+          <w:sz w:val="24"/>
+          <w:szCs w:val="24"/>
+        </w:rPr>
+        <w:t xml:space="preserve">Na minha opinião a regulação não é suficiente, ainda que o país tenha avançado desde 2008. Hoje existem o artigo 227 da Constituição (BRASIL, 1988), o artigo 37, §2º, do Código de Defesa do Consumidor (BRASIL, 1990), a Resolução nº 163 do CONANDA (2014), que considera abusiva a publicidade dirigida ao público infantil, a Lei Geral de Proteção de Dados (BRASIL, 2018) e a Lei nº 15.211/2025, o ECA Digital (BRASIL, 2025). No papel é bastante. Na prática a fiscalização é reativa e depende de denúncia, as empresas são globais enquanto a lei é nacional, e verificação de idade segue sendo a criança digitando outro ano de nascimento. As normas ainda descrevem publicidade em termos de jingle, personagem e desenho animado, categorias de televisão que não alcançam um vídeo de influenciador nem a loja interna de um jogo. O próprio filme já comparava o Brasil com países que legislaram de forma mais rígida, e a comparação continua constrangendo.</w:t>
+      </w:r>
+    </w:p>
+    <w:p>
+      <w:pPr>
+        <w:spacing w:after="0" w:before="140" w:line="360"/>
         <w:jc w:val="left"/>
       </w:pPr>
       <w:r>
@@ -350,42 +395,27 @@
           <w:sz w:val="24"/>
           <w:szCs w:val="24"/>
         </w:rPr>
-        <w:t xml:space="preserve">A responsabilidade primária é das marcas, porque a decisão de existir a campanha é delas — o que inclui responder pela cadeia inteira, do briefing à escolha do influenciador. As plataformas deixaram de ser neutras quando passaram a recomendar conteúdo: quem ordena, edita, e quem edita responde. Delas se exige não perfilar menores para fins publicitários, desativar por padrão o engajamento compulsivo e abrir-se a auditoria independente. Aos profissionais da comunicação cabe o núcleo ético: saber construir desejo é poder, e poder exige critério — o direito de recusa precisa ser parte legítima do ofício, não insubordinação.</w:t>
-      </w:r>
-    </w:p>
-    <w:p>
-      <w:pPr>
-        <w:spacing w:after="0" w:line="360"/>
-        <w:ind w:firstLine="709"/>
-        <w:jc w:val="both"/>
-      </w:pPr>
-      <w:r>
-        <w:rPr>
-          <w:rFonts w:ascii="Arial" w:cs="Arial" w:eastAsia="Arial" w:hAnsi="Arial"/>
-          <w:sz w:val="24"/>
-          <w:szCs w:val="24"/>
-        </w:rPr>
-        <w:t xml:space="preserve">As famílias têm o dever de mediação, mas é preciso recusar a transferência integral do problema para os pais. "Cabe aos pais dizer não" é o argumento preferido do setor porque individualiza um problema estrutural e penaliza mais as famílias com menos tempo e recursos — as que o documentário mostra mais frágeis. A mediação parental é necessária e insuficiente. À escola cabe a educação midiática, única resposta que constrói autonomia em vez de apenas restringir.</w:t>
-      </w:r>
-    </w:p>
-    <w:p>
-      <w:pPr>
-        <w:spacing w:after="0" w:line="360"/>
-        <w:ind w:firstLine="709"/>
-        <w:jc w:val="both"/>
-      </w:pPr>
-      <w:r>
-        <w:rPr>
-          <w:rFonts w:ascii="Arial" w:cs="Arial" w:eastAsia="Arial" w:hAnsi="Arial"/>
-          <w:sz w:val="24"/>
-          <w:szCs w:val="24"/>
-        </w:rPr>
-        <w:t xml:space="preserve">O maior mérito do documentário foi nomear a operação em curso: a conversão da infância em mercado. Mudou o meio — a publicidade televisiva era visível e finita, a digital é invisível e contínua —, não a estrutura. A pergunta ética do filme segue sem resposta: até que ponto é legítimo mobilizar as técnicas de persuasão mais sofisticadas já criadas contra alguém que não sabe que está sendo persuadido? Uma sociedade que responde "depende dos pais" já respondeu — e respondeu mal.</w:t>
-      </w:r>
-    </w:p>
-    <w:p>
-      <w:pPr>
-        <w:spacing w:after="0" w:before="200" w:line="360"/>
+        <w:t xml:space="preserve">A responsabilidade maior é das marcas, porque a campanha só existe se elas quiserem, e isso inclui o briefing e a escolha do influenciador. As plataformas perderam o direito de se dizer neutras quando passaram a recomendar conteúdo, já que recomendar é editar. Delas seria razoável exigir que não usem perfis de menores para publicidade e desliguem por padrão os mecanismos de engajamento compulsivo. Para quem trabalha com comunicação, competência técnica não é neutra: saber despertar desejo é poder, e poder pede critério. À escola cabe a educação midiática, única resposta que forma autonomia em vez de proibir.</w:t>
+      </w:r>
+    </w:p>
+    <w:p>
+      <w:pPr>
+        <w:spacing w:after="0" w:line="360"/>
+        <w:ind w:firstLine="709"/>
+        <w:jc w:val="both"/>
+      </w:pPr>
+      <w:r>
+        <w:rPr>
+          <w:rFonts w:ascii="Arial" w:cs="Arial" w:eastAsia="Arial" w:hAnsi="Arial"/>
+          <w:sz w:val="24"/>
+          <w:szCs w:val="24"/>
+        </w:rPr>
+        <w:t xml:space="preserve">O maior mérito do filme foi dar nome ao que estava acontecendo: a infância virando mercado. De 2008 para cá mudou o meio, não a estrutura. A propaganda de televisão era visível e acabava, a digital não é visível e não acaba. A pergunta que ficou comigo continua sem resposta boa: até onde é aceitável usar as melhores técnicas de persuasão já inventadas contra alguém que não sabe que está sendo persuadido, e ainda cobrar a conta de pais que mal têm tempo de chegar em casa acordados?</w:t>
+      </w:r>
+    </w:p>
+    <w:p>
+      <w:pPr>
+        <w:spacing w:after="0" w:before="140" w:line="360"/>
         <w:jc w:val="left"/>
       </w:pPr>
       <w:r>
@@ -410,35 +440,63 @@
           <w:sz w:val="24"/>
           <w:szCs w:val="24"/>
         </w:rPr>
-        <w:t xml:space="preserve">BRASIL. Código de Defesa do Consumidor. Lei nº 8.078/1990. Brasília, 1990.</w:t>
-      </w:r>
-    </w:p>
-    <w:p>
-      <w:pPr>
-        <w:spacing w:after="0" w:line="360"/>
-        <w:jc w:val="left"/>
-      </w:pPr>
-      <w:r>
-        <w:rPr>
-          <w:rFonts w:ascii="Arial" w:cs="Arial" w:eastAsia="Arial" w:hAnsi="Arial"/>
-          <w:sz w:val="24"/>
-          <w:szCs w:val="24"/>
-        </w:rPr>
-        <w:t xml:space="preserve">BRASIL. Lei Geral de Proteção de Dados. Lei nº 13.709/2018. Brasília, 2018.</w:t>
-      </w:r>
-    </w:p>
-    <w:p>
-      <w:pPr>
-        <w:spacing w:after="0" w:line="360"/>
-        <w:jc w:val="left"/>
-      </w:pPr>
-      <w:r>
-        <w:rPr>
-          <w:rFonts w:ascii="Arial" w:cs="Arial" w:eastAsia="Arial" w:hAnsi="Arial"/>
-          <w:sz w:val="24"/>
-          <w:szCs w:val="24"/>
-        </w:rPr>
-        <w:t xml:space="preserve">BRASIL. ECA Digital. Lei nº 15.211/2025. Brasília, 2025.</w:t>
+        <w:t xml:space="preserve">BAUMAN, Zygmunt. Vida para consumo: a transformação das pessoas em mercadoria. Rio de Janeiro: Zahar, 2008.</w:t>
+      </w:r>
+    </w:p>
+    <w:p>
+      <w:pPr>
+        <w:spacing w:after="0" w:line="360"/>
+        <w:jc w:val="left"/>
+      </w:pPr>
+      <w:r>
+        <w:rPr>
+          <w:rFonts w:ascii="Arial" w:cs="Arial" w:eastAsia="Arial" w:hAnsi="Arial"/>
+          <w:sz w:val="24"/>
+          <w:szCs w:val="24"/>
+        </w:rPr>
+        <w:t xml:space="preserve">BRASIL. Constituição da República Federativa do Brasil de 1988. Brasília, 1988.</w:t>
+      </w:r>
+    </w:p>
+    <w:p>
+      <w:pPr>
+        <w:spacing w:after="0" w:line="360"/>
+        <w:jc w:val="left"/>
+      </w:pPr>
+      <w:r>
+        <w:rPr>
+          <w:rFonts w:ascii="Arial" w:cs="Arial" w:eastAsia="Arial" w:hAnsi="Arial"/>
+          <w:sz w:val="24"/>
+          <w:szCs w:val="24"/>
+        </w:rPr>
+        <w:t xml:space="preserve">BRASIL. Lei nº 8.078, de 11 de setembro de 1990. Código de Defesa do Consumidor. Brasília, 1990.</w:t>
+      </w:r>
+    </w:p>
+    <w:p>
+      <w:pPr>
+        <w:spacing w:after="0" w:line="360"/>
+        <w:jc w:val="left"/>
+      </w:pPr>
+      <w:r>
+        <w:rPr>
+          <w:rFonts w:ascii="Arial" w:cs="Arial" w:eastAsia="Arial" w:hAnsi="Arial"/>
+          <w:sz w:val="24"/>
+          <w:szCs w:val="24"/>
+        </w:rPr>
+        <w:t xml:space="preserve">BRASIL. Lei nº 13.709, de 14 de agosto de 2018. Lei Geral de Proteção de Dados. Brasília, 2018.</w:t>
+      </w:r>
+    </w:p>
+    <w:p>
+      <w:pPr>
+        <w:spacing w:after="0" w:line="360"/>
+        <w:jc w:val="left"/>
+      </w:pPr>
+      <w:r>
+        <w:rPr>
+          <w:rFonts w:ascii="Arial" w:cs="Arial" w:eastAsia="Arial" w:hAnsi="Arial"/>
+          <w:sz w:val="24"/>
+          <w:szCs w:val="24"/>
+        </w:rPr>
+        <w:t xml:space="preserve">BRASIL. Lei nº 15.211, de 17 de setembro de 2025. ECA Digital. Brasília, 2025.</w:t>
       </w:r>
     </w:p>
     <w:p>
@@ -466,20 +524,6 @@
           <w:sz w:val="24"/>
           <w:szCs w:val="24"/>
         </w:rPr>
-        <w:t xml:space="preserve">CRIANÇA, a alma do negócio. Dir. Estela Renner. São Paulo: Maria Farinha, 2008.</w:t>
-      </w:r>
-    </w:p>
-    <w:p>
-      <w:pPr>
-        <w:spacing w:after="0" w:line="360"/>
-        <w:jc w:val="left"/>
-      </w:pPr>
-      <w:r>
-        <w:rPr>
-          <w:rFonts w:ascii="Arial" w:cs="Arial" w:eastAsia="Arial" w:hAnsi="Arial"/>
-          <w:sz w:val="24"/>
-          <w:szCs w:val="24"/>
-        </w:rPr>
         <w:t xml:space="preserve">JONAS, Hans. O princípio responsabilidade. Rio de Janeiro: Contraponto, 2006.</w:t>
       </w:r>
     </w:p>
@@ -494,7 +538,35 @@
           <w:sz w:val="24"/>
           <w:szCs w:val="24"/>
         </w:rPr>
-        <w:t xml:space="preserve">KANT, I. Fundamentação da metafísica dos costumes. São Paulo: Barcarolla, 2009.</w:t>
+        <w:t xml:space="preserve">KANT, Immanuel. Fundamentação da metafísica dos costumes. São Paulo: Barcarolla, 2009.</w:t>
+      </w:r>
+    </w:p>
+    <w:p>
+      <w:pPr>
+        <w:spacing w:after="0" w:line="360"/>
+        <w:jc w:val="left"/>
+      </w:pPr>
+      <w:r>
+        <w:rPr>
+          <w:rFonts w:ascii="Arial" w:cs="Arial" w:eastAsia="Arial" w:hAnsi="Arial"/>
+          <w:sz w:val="24"/>
+          <w:szCs w:val="24"/>
+        </w:rPr>
+        <w:t xml:space="preserve">RENNER, Estela (dir.). Criança, a alma do negócio. São Paulo: Maria Farinha Filmes, 2008. 1 vídeo (49 min).</w:t>
+      </w:r>
+    </w:p>
+    <w:p>
+      <w:pPr>
+        <w:spacing w:after="0" w:line="360"/>
+        <w:jc w:val="left"/>
+      </w:pPr>
+      <w:r>
+        <w:rPr>
+          <w:rFonts w:ascii="Arial" w:cs="Arial" w:eastAsia="Arial" w:hAnsi="Arial"/>
+          <w:sz w:val="24"/>
+          <w:szCs w:val="24"/>
+        </w:rPr>
+        <w:t xml:space="preserve">ZUBOFF, Shoshana. A era do capitalismo de vigilância. Rio de Janeiro: Intrínseca, 2021.</w:t>
       </w:r>
     </w:p>
     <w:sectPr>

</xml_diff>

<commit_message>
Reformat review to the ABNT critical-review template
Restructures the document to the model the course provided: institutional
header, right-aligned student identification, centred RESENHA CRÍTICA
title, the reviewed work's bibliographic data at the top, then continuous
prose instead of numbered sections.

- Opens with a paragraph on the director's background and filmography.
- Follows with summary paragraphs, then the reviewer's position, then
  final considerations and a recommendation of the work.
- Adds empirical backing for the CONAR critique from a 2023 Ciência &
  Saúde Coletiva study, cited with its DOI.
- Expands references to full ABNT NBR 6023 form with URLs and access
  dates, set single-spaced and left-aligned as the standard requires.
- Keeps the review text at three pages, with references following.

Co-Authored-By: Claude Fable 5 <noreply@anthropic.com>
Claude-Session: https://claude.ai/code/session_01VWDqYbQGufqqLk11LtZw9Q
</commit_message>
<xml_diff>
--- a/kelita_resenha_criança.docx
+++ b/kelita_resenha_criança.docx
@@ -4,7 +4,90 @@
   <w:body>
     <w:p>
       <w:pPr>
-        <w:spacing w:after="0" w:line="360"/>
+        <w:spacing w:after="0" w:line="240"/>
+        <w:jc w:val="left"/>
+      </w:pPr>
+      <w:r>
+        <w:rPr>
+          <w:rFonts w:ascii="Arial" w:cs="Arial" w:eastAsia="Arial" w:hAnsi="Arial"/>
+          <w:sz w:val="24"/>
+          <w:szCs w:val="24"/>
+        </w:rPr>
+        <w:t xml:space="preserve">[Nome da Universidade]</w:t>
+      </w:r>
+    </w:p>
+    <w:p>
+      <w:pPr>
+        <w:spacing w:after="0" w:line="240"/>
+        <w:jc w:val="left"/>
+      </w:pPr>
+      <w:r>
+        <w:rPr>
+          <w:rFonts w:ascii="Arial" w:cs="Arial" w:eastAsia="Arial" w:hAnsi="Arial"/>
+          <w:sz w:val="24"/>
+          <w:szCs w:val="24"/>
+        </w:rPr>
+        <w:t xml:space="preserve">[Faculdade ou Centro]</w:t>
+      </w:r>
+    </w:p>
+    <w:p>
+      <w:pPr>
+        <w:spacing w:after="0" w:line="240"/>
+        <w:jc w:val="left"/>
+      </w:pPr>
+      <w:r>
+        <w:rPr>
+          <w:rFonts w:ascii="Arial" w:cs="Arial" w:eastAsia="Arial" w:hAnsi="Arial"/>
+          <w:sz w:val="24"/>
+          <w:szCs w:val="24"/>
+        </w:rPr>
+        <w:t xml:space="preserve">[Departamento ou Curso]</w:t>
+      </w:r>
+    </w:p>
+    <w:p>
+      <w:pPr>
+        <w:spacing w:after="0" w:line="240"/>
+        <w:jc w:val="left"/>
+      </w:pPr>
+      <w:r>
+        <w:rPr>
+          <w:rFonts w:ascii="Arial" w:cs="Arial" w:eastAsia="Arial" w:hAnsi="Arial"/>
+          <w:sz w:val="24"/>
+          <w:szCs w:val="24"/>
+        </w:rPr>
+        <w:t xml:space="preserve">Disciplina: Ética</w:t>
+      </w:r>
+    </w:p>
+    <w:p>
+      <w:pPr>
+        <w:spacing w:after="0" w:line="240"/>
+        <w:jc w:val="left"/>
+      </w:pPr>
+      <w:r>
+        <w:rPr>
+          <w:rFonts w:ascii="Arial" w:cs="Arial" w:eastAsia="Arial" w:hAnsi="Arial"/>
+          <w:sz w:val="24"/>
+          <w:szCs w:val="24"/>
+        </w:rPr>
+        <w:t xml:space="preserve">Professor(a): [nome do(a) professor(a)]</w:t>
+      </w:r>
+    </w:p>
+    <w:p>
+      <w:pPr>
+        <w:spacing w:after="0" w:line="240"/>
+      </w:pPr>
+      <w:r>
+        <w:rPr>
+          <w:rFonts w:ascii="Arial" w:cs="Arial" w:eastAsia="Arial" w:hAnsi="Arial"/>
+          <w:sz w:val="24"/>
+          <w:szCs w:val="24"/>
+        </w:rPr>
+        <w:t xml:space="preserve"/>
+      </w:r>
+    </w:p>
+    <w:p>
+      <w:pPr>
+        <w:spacing w:after="0" w:line="240"/>
         <w:jc w:val="right"/>
       </w:pPr>
       <w:r>
@@ -13,26 +96,25 @@
           <w:sz w:val="24"/>
           <w:szCs w:val="24"/>
         </w:rPr>
-        <w:t xml:space="preserve">Disciplina: Ética</w:t>
-      </w:r>
-    </w:p>
-    <w:p>
-      <w:pPr>
-        <w:spacing w:after="0" w:line="360"/>
-        <w:jc w:val="right"/>
-      </w:pPr>
-      <w:r>
-        <w:rPr>
-          <w:rFonts w:ascii="Arial" w:cs="Arial" w:eastAsia="Arial" w:hAnsi="Arial"/>
-          <w:sz w:val="24"/>
-          <w:szCs w:val="24"/>
-        </w:rPr>
-        <w:t xml:space="preserve">Aluna: [seu nome completo]</w:t>
-      </w:r>
-    </w:p>
-    <w:p>
-      <w:pPr>
-        <w:spacing w:after="140" w:line="360"/>
+        <w:t xml:space="preserve">[Seu nome completo]</w:t>
+      </w:r>
+    </w:p>
+    <w:p>
+      <w:pPr>
+        <w:spacing w:after="0" w:line="240"/>
+      </w:pPr>
+      <w:r>
+        <w:rPr>
+          <w:rFonts w:ascii="Arial" w:cs="Arial" w:eastAsia="Arial" w:hAnsi="Arial"/>
+          <w:sz w:val="24"/>
+          <w:szCs w:val="24"/>
+        </w:rPr>
+        <w:t xml:space="preserve"/>
+      </w:r>
+    </w:p>
+    <w:p>
+      <w:pPr>
+        <w:spacing w:after="240" w:before="0" w:line="360"/>
         <w:jc w:val="center"/>
       </w:pPr>
       <w:r>
@@ -43,7 +125,7 @@
           <w:sz w:val="24"/>
           <w:szCs w:val="24"/>
         </w:rPr>
-        <w:t xml:space="preserve">A infância como mercado: uma leitura ética de Criança, a Alma do Negócio</w:t>
+        <w:t xml:space="preserve">RESENHA CRÍTICA</w:t>
       </w:r>
     </w:p>
     <w:p>
@@ -58,23 +140,20 @@
           <w:sz w:val="24"/>
           <w:szCs w:val="24"/>
         </w:rPr>
-        <w:t xml:space="preserve">RENNER, Estela (dir.). Criança, a alma do negócio. São Paulo: Maria Farinha Filmes, 2008. 1 vídeo (49 min).</w:t>
-      </w:r>
-    </w:p>
-    <w:p>
-      <w:pPr>
-        <w:spacing w:after="0" w:before="140" w:line="360"/>
-        <w:jc w:val="left"/>
-      </w:pPr>
-      <w:r>
-        <w:rPr>
-          <w:rFonts w:ascii="Arial" w:cs="Arial" w:eastAsia="Arial" w:hAnsi="Arial"/>
-          <w:b/>
-          <w:bCs/>
-          <w:sz w:val="24"/>
-          <w:szCs w:val="24"/>
-        </w:rPr>
-        <w:t xml:space="preserve">1. Introdução</w:t>
+        <w:t xml:space="preserve">RENNER, Estela. Criança, a alma do negócio. São Paulo: Maria Farinha Filmes, 2008. 1 vídeo (49 min), son., color. Disponível em: https://www.youtube.com/watch?v=ur9lIf4RaZ4. Acesso em: 9 ago. 2026.</w:t>
+      </w:r>
+    </w:p>
+    <w:p>
+      <w:pPr>
+        <w:spacing w:after="0" w:line="240"/>
+      </w:pPr>
+      <w:r>
+        <w:rPr>
+          <w:rFonts w:ascii="Arial" w:cs="Arial" w:eastAsia="Arial" w:hAnsi="Arial"/>
+          <w:sz w:val="24"/>
+          <w:szCs w:val="24"/>
+        </w:rPr>
+        <w:t xml:space="preserve"/>
       </w:r>
     </w:p>
     <w:p>
@@ -89,23 +168,7 @@
           <w:sz w:val="24"/>
           <w:szCs w:val="24"/>
         </w:rPr>
-        <w:t xml:space="preserve">Entrei em Criança, a Alma do Negócio esperando um filme sobre propaganda e saí pensando no que a gente faz com quem ainda não sabe se defender. O documentário de Estela Renner é de 2008, e a distância entre a televisão que ele retrata e o celular que as crianças usam hoje é enorme. Mesmo assim o argumento continua de pé: a publicidade infantil é difícil de justificar eticamente porque depende de uma coisa só, que é a criança não perceber que está sendo convencida.</w:t>
-      </w:r>
-    </w:p>
-    <w:p>
-      <w:pPr>
-        <w:spacing w:after="0" w:before="140" w:line="360"/>
-        <w:jc w:val="left"/>
-      </w:pPr>
-      <w:r>
-        <w:rPr>
-          <w:rFonts w:ascii="Arial" w:cs="Arial" w:eastAsia="Arial" w:hAnsi="Arial"/>
-          <w:b/>
-          <w:bCs/>
-          <w:sz w:val="24"/>
-          <w:szCs w:val="24"/>
-        </w:rPr>
-        <w:t xml:space="preserve">2. O que o filme mostra</w:t>
+        <w:t xml:space="preserve">Estela Renner é diretora e roteirista, cofundadora da Maria Farinha Filmes, produtora paulistana especializada em documentários de impacto social. Passou sete anos nos Estados Unidos, onde concluiu mestrado em Motion Pictures e trabalhou escrevendo e dirigindo séries de televisão, e ao voltar ao Brasil passou a dedicar sua obra a causas sociais e ambientais. Sua filmografia se concentra na infância: além de Criança, a Alma do Negócio, de 2008, ela assina Muito Além do Peso, de 2012, sobre obesidade infantil, e O Começo da Vida, de 2016, sobre os primeiros anos de desenvolvimento humano. Também dirigiu a série Aruanas. Seus dois primeiros documentários foram vistos por mais de dois milhões de pessoas e alimentaram o debate público sobre a regulação da publicidade dirigida a crianças.</w:t>
       </w:r>
     </w:p>
     <w:p>
@@ -120,7 +183,7 @@
           <w:sz w:val="24"/>
           <w:szCs w:val="24"/>
         </w:rPr>
-        <w:t xml:space="preserve">Logo no início, entre 1 e 3 minutos, aparece o dado que organiza o filme: cerca de 80% das decisões de compra de uma casa passam pela criança (RENNER, 2008). Isso não descreve gosto infantil, descreve função: a criança virou canal de venda para o orçamento da família.</w:t>
+        <w:t xml:space="preserve">O documentário resenhado tem 49 minutos e dispensa narração, alternando depoimentos de crianças, entrevistas com especialistas e falas de profissionais de marketing. Logo no início, entre 1 e 3 minutos, aparece o dado que organiza a obra: cerca de 80% das decisões de compra de uma casa passam pela criança. Isso não descreve gosto infantil, descreve função, porque a criança é tratada como canal de venda para o orçamento da família. Entre 5 e 8 minutos o filme mostra que a publicidade não vende o produto, vende pertencimento, já que a promessa não é o brinquedo e sim ser aceito por causa dele. Bauman (2008) descreve esse movimento ao mostrar uma sociedade em que as pessoas viram mercadoria e se validam pelo que exibem.</w:t>
       </w:r>
     </w:p>
     <w:p>
@@ -135,7 +198,7 @@
           <w:sz w:val="24"/>
           <w:szCs w:val="24"/>
         </w:rPr>
-        <w:t xml:space="preserve">O trecho mais forte está entre 5 e 8 minutos, quando fica claro que a publicidade não vende o produto, vende pertencimento. A promessa não é o brinquedo, é ser aceito por causa dele. Bauman (2008) descreve esse movimento ao mostrar uma sociedade em que as pessoas viram mercadoria e se validam pelo que exibem.</w:t>
+        <w:t xml:space="preserve">A partir daí a obra acumula evidência. Dos 13 aos 16 minutos aparecem crianças cercadas de brinquedos que nem conseguem usar. Entre 18 e 20 minutos, com a psicóloga Julia Marques, a discussão vai para a pressão do grupo, mostrando que o consumo decide quem entra e quem fica de fora e produz uma padronização de festas e roupas. Entre 21 e 23 minutos o filme trata dos pais, da culpa e da falta de tempo, com o presente ocupando o lugar da presença. Dos 36 aos 38 minutos entra a saúde, ligando publicidade de ultraprocessado, sedentarismo e obesidade infantil. O trecho entre 40 e 44 minutos é o mais político da obra e dirige sua crítica ao CONAR.</w:t>
       </w:r>
     </w:p>
     <w:p>
@@ -150,23 +213,7 @@
           <w:sz w:val="24"/>
           <w:szCs w:val="24"/>
         </w:rPr>
-        <w:t xml:space="preserve">O filme então acumula prova. Dos 13 aos 16 minutos aparecem crianças cercadas de brinquedos que nem conseguem usar. Entre 18 e 20 minutos, com a psicóloga Julia Marques, a discussão vai para a pressão do grupo: o consumo decide quem entra e quem fica de fora, e o resultado é uma padronização de festas e roupas que sufoca o que diferencia uma criança da outra.</w:t>
-      </w:r>
-    </w:p>
-    <w:p>
-      <w:pPr>
-        <w:spacing w:after="0" w:before="140" w:line="360"/>
-        <w:jc w:val="left"/>
-      </w:pPr>
-      <w:r>
-        <w:rPr>
-          <w:rFonts w:ascii="Arial" w:cs="Arial" w:eastAsia="Arial" w:hAnsi="Arial"/>
-          <w:b/>
-          <w:bCs/>
-          <w:sz w:val="24"/>
-          <w:szCs w:val="24"/>
-        </w:rPr>
-        <w:t xml:space="preserve">3. Os pais também estão no alvo</w:t>
+        <w:t xml:space="preserve">O ponto mais forte do filme é formal: ele não precisa argumentar, basta mostrar. As falas dos profissionais de marketing são mais desconfortáveis do que qualquer cena com criança, porque não há vilania ali, há competência técnica descrevendo com naturalidade a exploração de uma vulnerabilidade. Meu principal reparo, porém, está no tratamento dado às famílias. A obra descreve o comportamento dos pais sem perguntar o que o produziu. Quem cede não está sendo permissivo por preguiça, está comprimido por uma jornada de trabalho que não deixa espaço para muito mais, e comprar vira a forma disponível de dizer que se importa. Chamar isso de fracasso individual é ignorar que a mesma lógica econômica que vende para a criança é a que consome o tempo do pai.</w:t>
       </w:r>
     </w:p>
     <w:p>
@@ -181,7 +228,7 @@
           <w:sz w:val="24"/>
           <w:szCs w:val="24"/>
         </w:rPr>
-        <w:t xml:space="preserve">Entre 21 e 23 minutos o documentário olha para os pais e fala em culpa e falta de tempo, com o presente ocupando o lugar da presença (RENNER, 2008). Concordo com o diagnóstico, mas o filme para cedo: descreve o comportamento dos pais sem perguntar o que o produziu.</w:t>
+        <w:t xml:space="preserve">O segundo reparo é de época, e não é culpa da direção. Em 2008 o comercial ainda tinha moldura, porque começava, terminava e ocupava um bloco separado, coisa que dava para ensinar uma criança a reconhecer. Essa borda sumiu. Hoje a publicidade não interrompe o conteúdo, ela é o conteúdo, e mudou também de onde vem: não é mais a campanha de uma grande marca em horário nobre, é um vídeo no YouTube ou no TikTok feito por alguém que a criança acompanha todo dia. Luccas Neto é o caso mais evidente no Brasil, com plateia de milhões de crianças e produtos licenciados próprios. Os jogos operam por outro mecanismo, com moedas virtuais que afastam o preço do valor e caixas de recompensa que repetem a lógica de prêmio aleatório das máquinas de apostas.</w:t>
       </w:r>
     </w:p>
     <w:p>
@@ -196,7 +243,7 @@
           <w:sz w:val="24"/>
           <w:szCs w:val="24"/>
         </w:rPr>
-        <w:t xml:space="preserve">Quem cede não está sendo permissivo por preguiça, está comprimido por uma jornada que não deixa espaço para muito mais. Um adulto que sai cedo, volta à noite e ainda leva serviço para o fim de semana não tem como disputar atenção com uma tela ligada o dia inteiro. Comprar vira a forma disponível de dizer que se importa. Chamar isso de fracasso individual é ignorar que a mesma lógica que vende para a criança é a que consome o tempo do pai.</w:t>
+        <w:t xml:space="preserve">No plano ético, o problema mais básico é o consentimento, porque qualquer relação de consumo defensável supõe alguém informado, capaz de avaliar e recusar, e criança não é isso. Vem depois a instrumentalização: se a pessoa deve ser tratada sempre também como fim e nunca apenas como meio (KANT, 2009), aqueles 80% da abertura dizem tudo. A crítica ao CONAR também segue de pé e hoje tem respaldo empírico, pois Matos et al. (2023) analisaram as denúncias de publicidade de alimentos dirigida a crianças enviadas ao órgão entre 2010 e 2020 e encontraram apenas 98 casos, com tendência de queda, o que indica que a autorregulação não protege quem deveria proteger. Some a isso a coleta de dados, que Zuboff (2021) descreve como base de um capitalismo que lucra prevendo comportamento, e a responsabilidade repartida entre anunciante, agência, plataforma e influenciador. Jonas (2006) serve aqui: o dever cresce com a fragilidade de quem é afetado e o poder de quem age.</w:t>
       </w:r>
     </w:p>
     <w:p>
@@ -211,23 +258,7 @@
           <w:sz w:val="24"/>
           <w:szCs w:val="24"/>
         </w:rPr>
-        <w:t xml:space="preserve">Por isso me parece equivocado tratar a família como linha de defesa principal. Ela é o elo mais fraco da corrente, e é por isso que o mercado mira nela. Dizer que basta os pais dizerem não converte um problema estrutural em falha de caráter, e esse deslocamento pesa sobre quem tem menos tempo e menos dinheiro. Acompanhar é dever, mas exigir que a família resolva sozinha é passar ao mais fraco a responsabilidade do mais forte.</w:t>
-      </w:r>
-    </w:p>
-    <w:p>
-      <w:pPr>
-        <w:spacing w:after="0" w:before="140" w:line="360"/>
-        <w:jc w:val="left"/>
-      </w:pPr>
-      <w:r>
-        <w:rPr>
-          <w:rFonts w:ascii="Arial" w:cs="Arial" w:eastAsia="Arial" w:hAnsi="Arial"/>
-          <w:b/>
-          <w:bCs/>
-          <w:sz w:val="24"/>
-          <w:szCs w:val="24"/>
-        </w:rPr>
-        <w:t xml:space="preserve">4. Da televisão para a tela do celular</w:t>
+        <w:t xml:space="preserve">Quanto à legislação, avalio que ainda não é suficiente, embora o país tenha avançado desde 2008. Hoje existem o artigo 227 da Constituição (BRASIL, 1988), o artigo 37, §2º, do Código de Defesa do Consumidor (BRASIL, 1990), a Resolução nº 163 do CONANDA (2014), que considera abusiva a publicidade dirigida ao público infantil, a Lei Geral de Proteção de Dados (BRASIL, 2018) e o Estatuto Digital da Criança e do Adolescente (BRASIL, 2025), em vigor desde março de 2026. No papel é bastante. Na prática a fiscalização é reativa e depende de denúncia, as empresas são globais enquanto a lei é nacional, e a verificação de idade segue sendo a criança digitando outro ano de nascimento. Cabe às marcas a responsabilidade primária, às plataformas o fim da alegação de neutralidade, aos profissionais de comunicação o critério sobre o que aceitam produzir, e à escola a educação midiática.</w:t>
       </w:r>
     </w:p>
     <w:p>
@@ -242,43 +273,13 @@
           <w:sz w:val="24"/>
           <w:szCs w:val="24"/>
         </w:rPr>
-        <w:t xml:space="preserve">É aqui que o filme mostra a idade. Em 2008 o comercial tinha moldura: começava, terminava e ocupava um bloco separado, coisa que dava para ensinar uma criança a reconhecer. Essa borda sumiu, e hoje a publicidade não interrompe o conteúdo, ela é o conteúdo.</w:t>
-      </w:r>
-    </w:p>
-    <w:p>
-      <w:pPr>
-        <w:spacing w:after="0" w:line="360"/>
-        <w:ind w:firstLine="709"/>
-        <w:jc w:val="both"/>
-      </w:pPr>
-      <w:r>
-        <w:rPr>
-          <w:rFonts w:ascii="Arial" w:cs="Arial" w:eastAsia="Arial" w:hAnsi="Arial"/>
-          <w:sz w:val="24"/>
-          <w:szCs w:val="24"/>
-        </w:rPr>
-        <w:t xml:space="preserve">Mudou também de onde ela vem. Não é mais a campanha de uma grande marca em horário nobre, é um vídeo no YouTube ou no TikTok feito por alguém que a criança acompanha todo dia. Luccas Neto é o caso mais evidente no Brasil, com plateia de milhões de crianças e produtos licenciados próprios. O pai que enfrenta o pedido do filho não negocia com um anunciante, e sim com alguém em quem a criança confia, e que ela vê mais vezes por semana do que vê o próprio pai acordado.</w:t>
-      </w:r>
-    </w:p>
-    <w:p>
-      <w:pPr>
-        <w:spacing w:after="0" w:line="360"/>
-        <w:ind w:firstLine="709"/>
-        <w:jc w:val="both"/>
-      </w:pPr>
-      <w:r>
-        <w:rPr>
-          <w:rFonts w:ascii="Arial" w:cs="Arial" w:eastAsia="Arial" w:hAnsi="Arial"/>
-          <w:sz w:val="24"/>
-          <w:szCs w:val="24"/>
-        </w:rPr>
-        <w:t xml:space="preserve">Os jogos seguem outro caminho. Robux, V-Bucks e diamantes afastam o preço do valor. Caixa de recompensa repete a lógica de prêmio aleatório das máquinas de apostas, passe de temporada fabrica pressa e skin transforma pertencer em compra. É a mesma pressão de grupo dos 18 minutos do filme, agora num sistema de pagamento aberto a qualquer hora.</w:t>
-      </w:r>
-    </w:p>
-    <w:p>
-      <w:pPr>
-        <w:spacing w:after="0" w:before="140" w:line="360"/>
-        <w:jc w:val="left"/>
+        <w:t xml:space="preserve">O maior mérito da obra foi dar nome ao que estava acontecendo: a infância virando mercado. De 2008 para cá mudou o meio, não a estrutura, porque a propaganda de televisão era visível e acabava, enquanto a digital não é visível e não acaba. A linguagem é acessível e o filme não exige repertório prévio, o que amplia bastante seu alcance. Recomendo a obra a estudantes e profissionais de comunicação, publicidade e marketing, a professores da educação básica, a profissionais de saúde e do direito da criança e às próprias famílias, com uma ressalva: hoje ela precisa ser assistida também como documento histórico e complementada por material sobre influenciadores digitais e economia de jogos, terreno onde a publicidade infantil de fato acontece.</w:t>
+      </w:r>
+    </w:p>
+    <w:p>
+      <w:pPr>
+        <w:spacing w:after="240" w:before="280" w:line="360"/>
+        <w:jc w:val="center"/>
       </w:pPr>
       <w:r>
         <w:rPr>
@@ -288,150 +289,12 @@
           <w:sz w:val="24"/>
           <w:szCs w:val="24"/>
         </w:rPr>
-        <w:t xml:space="preserve">5. Saúde e desafios éticos</w:t>
-      </w:r>
-    </w:p>
-    <w:p>
-      <w:pPr>
-        <w:spacing w:after="0" w:line="360"/>
-        <w:ind w:firstLine="709"/>
-        <w:jc w:val="both"/>
-      </w:pPr>
-      <w:r>
-        <w:rPr>
-          <w:rFonts w:ascii="Arial" w:cs="Arial" w:eastAsia="Arial" w:hAnsi="Arial"/>
-          <w:sz w:val="24"/>
-          <w:szCs w:val="24"/>
-        </w:rPr>
-        <w:t xml:space="preserve">Dos 36 aos 38 minutos o filme entra na saúde e o argumento vira dado. A ligação entre publicidade de ultraprocessado, sedentarismo e obesidade infantil tira o assunto do terreno da escolha individual: não foi a criança que escolheu mal, foi uma estratégia de marketing produzindo um problema de saúde pública.</w:t>
-      </w:r>
-    </w:p>
-    <w:p>
-      <w:pPr>
-        <w:spacing w:after="0" w:line="360"/>
-        <w:ind w:firstLine="709"/>
-        <w:jc w:val="both"/>
-      </w:pPr>
-      <w:r>
-        <w:rPr>
-          <w:rFonts w:ascii="Arial" w:cs="Arial" w:eastAsia="Arial" w:hAnsi="Arial"/>
-          <w:sz w:val="24"/>
-          <w:szCs w:val="24"/>
-        </w:rPr>
-        <w:t xml:space="preserve">No plano ético, o problema mais básico é o consentimento. Qualquer relação de consumo ética supõe alguém informado, capaz de avaliar e recusar, e criança não é isso. Vem depois a instrumentalização: se a pessoa deve ser tratada sempre também como fim e nunca apenas como meio (KANT, 2009), aqueles 80% da abertura dizem tudo. Mais grave, porém, é que essa publicidade só rende enquanto passa despercebida. Uma prática que depende da ignorância de quem a recebe não sobreviveria se seus métodos fossem ditos em voz alta, e é por isso que o filme incomoda sem acusar ninguém. Some a isso a coleta de dados, que Zuboff (2021) descreve como base de um capitalismo que lucra prevendo comportamento, e a responsabilidade repartida entre anunciante, agência, plataforma e influenciador. Jonas (2006) serve aqui: para ele o dever cresce com a fragilidade de quem é afetado e o poder de quem age.</w:t>
-      </w:r>
-    </w:p>
-    <w:p>
-      <w:pPr>
-        <w:spacing w:after="0" w:before="140" w:line="360"/>
-        <w:jc w:val="left"/>
-      </w:pPr>
-      <w:r>
-        <w:rPr>
-          <w:rFonts w:ascii="Arial" w:cs="Arial" w:eastAsia="Arial" w:hAnsi="Arial"/>
-          <w:b/>
-          <w:bCs/>
-          <w:sz w:val="24"/>
-          <w:szCs w:val="24"/>
-        </w:rPr>
-        <w:t xml:space="preserve">6. A regulamentação é suficiente?</w:t>
-      </w:r>
-    </w:p>
-    <w:p>
-      <w:pPr>
-        <w:spacing w:after="0" w:line="360"/>
-        <w:ind w:firstLine="709"/>
-        <w:jc w:val="both"/>
-      </w:pPr>
-      <w:r>
-        <w:rPr>
-          <w:rFonts w:ascii="Arial" w:cs="Arial" w:eastAsia="Arial" w:hAnsi="Arial"/>
-          <w:sz w:val="24"/>
-          <w:szCs w:val="24"/>
-        </w:rPr>
-        <w:t xml:space="preserve">O trecho entre 40 e 44 minutos é o mais político do filme, e mira o CONAR (RENNER, 2008). A crítica é certeira, porque se trata de autorregulação, o próprio setor publicitário julgando o setor publicitário, e a sanção mais dura é recomendar que o anúncio saia do ar, normalmente depois de a campanha já ter dado o retorno.</w:t>
-      </w:r>
-    </w:p>
-    <w:p>
-      <w:pPr>
-        <w:spacing w:after="0" w:line="360"/>
-        <w:ind w:firstLine="709"/>
-        <w:jc w:val="both"/>
-      </w:pPr>
-      <w:r>
-        <w:rPr>
-          <w:rFonts w:ascii="Arial" w:cs="Arial" w:eastAsia="Arial" w:hAnsi="Arial"/>
-          <w:sz w:val="24"/>
-          <w:szCs w:val="24"/>
-        </w:rPr>
-        <w:t xml:space="preserve">Na minha opinião a regulação não é suficiente, ainda que o país tenha avançado desde 2008. Hoje existem o artigo 227 da Constituição (BRASIL, 1988), o artigo 37, §2º, do Código de Defesa do Consumidor (BRASIL, 1990), a Resolução nº 163 do CONANDA (2014), que considera abusiva a publicidade dirigida ao público infantil, a Lei Geral de Proteção de Dados (BRASIL, 2018) e a Lei nº 15.211/2025, o ECA Digital (BRASIL, 2025). No papel é bastante. Na prática a fiscalização é reativa e depende de denúncia, as empresas são globais enquanto a lei é nacional, e verificação de idade segue sendo a criança digitando outro ano de nascimento. As normas ainda descrevem publicidade em termos de jingle, personagem e desenho animado, categorias de televisão que não alcançam um vídeo de influenciador nem a loja interna de um jogo. O próprio filme já comparava o Brasil com países que legislaram de forma mais rígida, e a comparação continua constrangendo.</w:t>
-      </w:r>
-    </w:p>
-    <w:p>
-      <w:pPr>
-        <w:spacing w:after="0" w:before="140" w:line="360"/>
-        <w:jc w:val="left"/>
-      </w:pPr>
-      <w:r>
-        <w:rPr>
-          <w:rFonts w:ascii="Arial" w:cs="Arial" w:eastAsia="Arial" w:hAnsi="Arial"/>
-          <w:b/>
-          <w:bCs/>
-          <w:sz w:val="24"/>
-          <w:szCs w:val="24"/>
-        </w:rPr>
-        <w:t xml:space="preserve">7. Responsabilidades e considerações finais</w:t>
-      </w:r>
-    </w:p>
-    <w:p>
-      <w:pPr>
-        <w:spacing w:after="0" w:line="360"/>
-        <w:ind w:firstLine="709"/>
-        <w:jc w:val="both"/>
-      </w:pPr>
-      <w:r>
-        <w:rPr>
-          <w:rFonts w:ascii="Arial" w:cs="Arial" w:eastAsia="Arial" w:hAnsi="Arial"/>
-          <w:sz w:val="24"/>
-          <w:szCs w:val="24"/>
-        </w:rPr>
-        <w:t xml:space="preserve">A responsabilidade maior é das marcas, porque a campanha só existe se elas quiserem, e isso inclui o briefing e a escolha do influenciador. As plataformas perderam o direito de se dizer neutras quando passaram a recomendar conteúdo, já que recomendar é editar. Delas seria razoável exigir que não usem perfis de menores para publicidade e desliguem por padrão os mecanismos de engajamento compulsivo. Para quem trabalha com comunicação, competência técnica não é neutra: saber despertar desejo é poder, e poder pede critério. À escola cabe a educação midiática, única resposta que forma autonomia em vez de proibir.</w:t>
-      </w:r>
-    </w:p>
-    <w:p>
-      <w:pPr>
-        <w:spacing w:after="0" w:line="360"/>
-        <w:ind w:firstLine="709"/>
-        <w:jc w:val="both"/>
-      </w:pPr>
-      <w:r>
-        <w:rPr>
-          <w:rFonts w:ascii="Arial" w:cs="Arial" w:eastAsia="Arial" w:hAnsi="Arial"/>
-          <w:sz w:val="24"/>
-          <w:szCs w:val="24"/>
-        </w:rPr>
-        <w:t xml:space="preserve">O maior mérito do filme foi dar nome ao que estava acontecendo: a infância virando mercado. De 2008 para cá mudou o meio, não a estrutura. A propaganda de televisão era visível e acabava, a digital não é visível e não acaba. A pergunta que ficou comigo continua sem resposta boa: até onde é aceitável usar as melhores técnicas de persuasão já inventadas contra alguém que não sabe que está sendo persuadido, e ainda cobrar a conta de pais que mal têm tempo de chegar em casa acordados?</w:t>
-      </w:r>
-    </w:p>
-    <w:p>
-      <w:pPr>
-        <w:spacing w:after="0" w:before="140" w:line="360"/>
-        <w:jc w:val="left"/>
-      </w:pPr>
-      <w:r>
-        <w:rPr>
-          <w:rFonts w:ascii="Arial" w:cs="Arial" w:eastAsia="Arial" w:hAnsi="Arial"/>
-          <w:b/>
-          <w:bCs/>
-          <w:sz w:val="24"/>
-          <w:szCs w:val="24"/>
-        </w:rPr>
-        <w:t xml:space="preserve">Referências</w:t>
-      </w:r>
-    </w:p>
-    <w:p>
-      <w:pPr>
-        <w:spacing w:after="0" w:line="360"/>
+        <w:t xml:space="preserve">REFERÊNCIAS</w:t>
+      </w:r>
+    </w:p>
+    <w:p>
+      <w:pPr>
+        <w:spacing w:after="240" w:line="240"/>
         <w:jc w:val="left"/>
       </w:pPr>
       <w:r>
@@ -445,91 +308,91 @@
     </w:p>
     <w:p>
       <w:pPr>
-        <w:spacing w:after="0" w:line="360"/>
-        <w:jc w:val="left"/>
-      </w:pPr>
-      <w:r>
-        <w:rPr>
-          <w:rFonts w:ascii="Arial" w:cs="Arial" w:eastAsia="Arial" w:hAnsi="Arial"/>
-          <w:sz w:val="24"/>
-          <w:szCs w:val="24"/>
-        </w:rPr>
-        <w:t xml:space="preserve">BRASIL. Constituição da República Federativa do Brasil de 1988. Brasília, 1988.</w:t>
-      </w:r>
-    </w:p>
-    <w:p>
-      <w:pPr>
-        <w:spacing w:after="0" w:line="360"/>
-        <w:jc w:val="left"/>
-      </w:pPr>
-      <w:r>
-        <w:rPr>
-          <w:rFonts w:ascii="Arial" w:cs="Arial" w:eastAsia="Arial" w:hAnsi="Arial"/>
-          <w:sz w:val="24"/>
-          <w:szCs w:val="24"/>
-        </w:rPr>
-        <w:t xml:space="preserve">BRASIL. Lei nº 8.078, de 11 de setembro de 1990. Código de Defesa do Consumidor. Brasília, 1990.</w:t>
-      </w:r>
-    </w:p>
-    <w:p>
-      <w:pPr>
-        <w:spacing w:after="0" w:line="360"/>
-        <w:jc w:val="left"/>
-      </w:pPr>
-      <w:r>
-        <w:rPr>
-          <w:rFonts w:ascii="Arial" w:cs="Arial" w:eastAsia="Arial" w:hAnsi="Arial"/>
-          <w:sz w:val="24"/>
-          <w:szCs w:val="24"/>
-        </w:rPr>
-        <w:t xml:space="preserve">BRASIL. Lei nº 13.709, de 14 de agosto de 2018. Lei Geral de Proteção de Dados. Brasília, 2018.</w:t>
-      </w:r>
-    </w:p>
-    <w:p>
-      <w:pPr>
-        <w:spacing w:after="0" w:line="360"/>
-        <w:jc w:val="left"/>
-      </w:pPr>
-      <w:r>
-        <w:rPr>
-          <w:rFonts w:ascii="Arial" w:cs="Arial" w:eastAsia="Arial" w:hAnsi="Arial"/>
-          <w:sz w:val="24"/>
-          <w:szCs w:val="24"/>
-        </w:rPr>
-        <w:t xml:space="preserve">BRASIL. Lei nº 15.211, de 17 de setembro de 2025. ECA Digital. Brasília, 2025.</w:t>
-      </w:r>
-    </w:p>
-    <w:p>
-      <w:pPr>
-        <w:spacing w:after="0" w:line="360"/>
-        <w:jc w:val="left"/>
-      </w:pPr>
-      <w:r>
-        <w:rPr>
-          <w:rFonts w:ascii="Arial" w:cs="Arial" w:eastAsia="Arial" w:hAnsi="Arial"/>
-          <w:sz w:val="24"/>
-          <w:szCs w:val="24"/>
-        </w:rPr>
-        <w:t xml:space="preserve">CONANDA. Resolução nº 163, de 13 de março de 2014. Brasília, 2014.</w:t>
-      </w:r>
-    </w:p>
-    <w:p>
-      <w:pPr>
-        <w:spacing w:after="0" w:line="360"/>
-        <w:jc w:val="left"/>
-      </w:pPr>
-      <w:r>
-        <w:rPr>
-          <w:rFonts w:ascii="Arial" w:cs="Arial" w:eastAsia="Arial" w:hAnsi="Arial"/>
-          <w:sz w:val="24"/>
-          <w:szCs w:val="24"/>
-        </w:rPr>
-        <w:t xml:space="preserve">JONAS, Hans. O princípio responsabilidade. Rio de Janeiro: Contraponto, 2006.</w:t>
-      </w:r>
-    </w:p>
-    <w:p>
-      <w:pPr>
-        <w:spacing w:after="0" w:line="360"/>
+        <w:spacing w:after="240" w:line="240"/>
+        <w:jc w:val="left"/>
+      </w:pPr>
+      <w:r>
+        <w:rPr>
+          <w:rFonts w:ascii="Arial" w:cs="Arial" w:eastAsia="Arial" w:hAnsi="Arial"/>
+          <w:sz w:val="24"/>
+          <w:szCs w:val="24"/>
+        </w:rPr>
+        <w:t xml:space="preserve">BRASIL. [Constituição (1988)]. Constituição da República Federativa do Brasil de 1988. Brasília, DF: Presidência da República, 1988. Disponível em: https://www.planalto.gov.br/ccivil_03/constituicao/constituicao.htm. Acesso em: 9 ago. 2026.</w:t>
+      </w:r>
+    </w:p>
+    <w:p>
+      <w:pPr>
+        <w:spacing w:after="240" w:line="240"/>
+        <w:jc w:val="left"/>
+      </w:pPr>
+      <w:r>
+        <w:rPr>
+          <w:rFonts w:ascii="Arial" w:cs="Arial" w:eastAsia="Arial" w:hAnsi="Arial"/>
+          <w:sz w:val="24"/>
+          <w:szCs w:val="24"/>
+        </w:rPr>
+        <w:t xml:space="preserve">BRASIL. Lei nº 8.078, de 11 de setembro de 1990. Dispõe sobre a proteção do consumidor e dá outras providências. Brasília, DF: Presidência da República, 1990. Disponível em: https://www.planalto.gov.br/ccivil_03/leis/l8078compilado.htm. Acesso em: 9 ago. 2026.</w:t>
+      </w:r>
+    </w:p>
+    <w:p>
+      <w:pPr>
+        <w:spacing w:after="240" w:line="240"/>
+        <w:jc w:val="left"/>
+      </w:pPr>
+      <w:r>
+        <w:rPr>
+          <w:rFonts w:ascii="Arial" w:cs="Arial" w:eastAsia="Arial" w:hAnsi="Arial"/>
+          <w:sz w:val="24"/>
+          <w:szCs w:val="24"/>
+        </w:rPr>
+        <w:t xml:space="preserve">BRASIL. Lei nº 13.709, de 14 de agosto de 2018. Lei Geral de Proteção de Dados Pessoais (LGPD). Brasília, DF: Presidência da República, 2018. Disponível em: https://www.planalto.gov.br/ccivil_03/_ato2015-2018/2018/lei/l13709.htm. Acesso em: 9 ago. 2026.</w:t>
+      </w:r>
+    </w:p>
+    <w:p>
+      <w:pPr>
+        <w:spacing w:after="240" w:line="240"/>
+        <w:jc w:val="left"/>
+      </w:pPr>
+      <w:r>
+        <w:rPr>
+          <w:rFonts w:ascii="Arial" w:cs="Arial" w:eastAsia="Arial" w:hAnsi="Arial"/>
+          <w:sz w:val="24"/>
+          <w:szCs w:val="24"/>
+        </w:rPr>
+        <w:t xml:space="preserve">BRASIL. Lei nº 15.211, de 17 de setembro de 2025. Institui o Estatuto Digital da Criança e do Adolescente. Brasília, DF: Presidência da República, 2025. Disponível em: https://www.planalto.gov.br/ccivil_03/_ato2023-2026/2025/lei/L15211.htm. Acesso em: 9 ago. 2026.</w:t>
+      </w:r>
+    </w:p>
+    <w:p>
+      <w:pPr>
+        <w:spacing w:after="240" w:line="240"/>
+        <w:jc w:val="left"/>
+      </w:pPr>
+      <w:r>
+        <w:rPr>
+          <w:rFonts w:ascii="Arial" w:cs="Arial" w:eastAsia="Arial" w:hAnsi="Arial"/>
+          <w:sz w:val="24"/>
+          <w:szCs w:val="24"/>
+        </w:rPr>
+        <w:t xml:space="preserve">CONANDA. Resolução nº 163, de 13 de março de 2014. Dispõe sobre a abusividade do direcionamento de publicidade e de comunicação mercadológica à criança e ao adolescente. Brasília, DF: Conselho Nacional dos Direitos da Criança e do Adolescente, 2014. Disponível em: https://www.gov.br/mdh/pt-br/acesso-a-informacao/participacao-social/conselho-nacional-dos-direitos-da-crianca-e-do-adolescente-conanda/resolucoes/resolucao-163-_publicidade-infantil.pdf. Acesso em: 9 ago. 2026.</w:t>
+      </w:r>
+    </w:p>
+    <w:p>
+      <w:pPr>
+        <w:spacing w:after="240" w:line="240"/>
+        <w:jc w:val="left"/>
+      </w:pPr>
+      <w:r>
+        <w:rPr>
+          <w:rFonts w:ascii="Arial" w:cs="Arial" w:eastAsia="Arial" w:hAnsi="Arial"/>
+          <w:sz w:val="24"/>
+          <w:szCs w:val="24"/>
+        </w:rPr>
+        <w:t xml:space="preserve">JONAS, Hans. O princípio responsabilidade: ensaio de uma ética para a civilização tecnológica. Rio de Janeiro: Contraponto, 2006.</w:t>
+      </w:r>
+    </w:p>
+    <w:p>
+      <w:pPr>
+        <w:spacing w:after="240" w:line="240"/>
         <w:jc w:val="left"/>
       </w:pPr>
       <w:r>
@@ -543,30 +406,44 @@
     </w:p>
     <w:p>
       <w:pPr>
-        <w:spacing w:after="0" w:line="360"/>
-        <w:jc w:val="left"/>
-      </w:pPr>
-      <w:r>
-        <w:rPr>
-          <w:rFonts w:ascii="Arial" w:cs="Arial" w:eastAsia="Arial" w:hAnsi="Arial"/>
-          <w:sz w:val="24"/>
-          <w:szCs w:val="24"/>
-        </w:rPr>
-        <w:t xml:space="preserve">RENNER, Estela (dir.). Criança, a alma do negócio. São Paulo: Maria Farinha Filmes, 2008. 1 vídeo (49 min).</w:t>
-      </w:r>
-    </w:p>
-    <w:p>
-      <w:pPr>
-        <w:spacing w:after="0" w:line="360"/>
-        <w:jc w:val="left"/>
-      </w:pPr>
-      <w:r>
-        <w:rPr>
-          <w:rFonts w:ascii="Arial" w:cs="Arial" w:eastAsia="Arial" w:hAnsi="Arial"/>
-          <w:sz w:val="24"/>
-          <w:szCs w:val="24"/>
-        </w:rPr>
-        <w:t xml:space="preserve">ZUBOFF, Shoshana. A era do capitalismo de vigilância. Rio de Janeiro: Intrínseca, 2021.</w:t>
+        <w:spacing w:after="240" w:line="240"/>
+        <w:jc w:val="left"/>
+      </w:pPr>
+      <w:r>
+        <w:rPr>
+          <w:rFonts w:ascii="Arial" w:cs="Arial" w:eastAsia="Arial" w:hAnsi="Arial"/>
+          <w:sz w:val="24"/>
+          <w:szCs w:val="24"/>
+        </w:rPr>
+        <w:t xml:space="preserve">MATOS, J. P.; GONDO, M.; MOTA, L. S. E.; HORTA, P. M. Publicidade de alimentos direcionada à criança e ao adolescente no Brasil: análise longitudinal de denúncias no CONAR. Ciência &amp; Saúde Coletiva, v. 28, n. 7, p. 1959-1970, 2023. DOI: https://doi.org/10.1590/1413-81232023287.14752022. Acesso em: 9 ago. 2026.</w:t>
+      </w:r>
+    </w:p>
+    <w:p>
+      <w:pPr>
+        <w:spacing w:after="240" w:line="240"/>
+        <w:jc w:val="left"/>
+      </w:pPr>
+      <w:r>
+        <w:rPr>
+          <w:rFonts w:ascii="Arial" w:cs="Arial" w:eastAsia="Arial" w:hAnsi="Arial"/>
+          <w:sz w:val="24"/>
+          <w:szCs w:val="24"/>
+        </w:rPr>
+        <w:t xml:space="preserve">RENNER, Estela. Criança, a alma do negócio. São Paulo: Maria Farinha Filmes, 2008. 1 vídeo (49 min), son., color. Disponível em: https://www.youtube.com/watch?v=ur9lIf4RaZ4. Acesso em: 9 ago. 2026.</w:t>
+      </w:r>
+    </w:p>
+    <w:p>
+      <w:pPr>
+        <w:spacing w:after="240" w:line="240"/>
+        <w:jc w:val="left"/>
+      </w:pPr>
+      <w:r>
+        <w:rPr>
+          <w:rFonts w:ascii="Arial" w:cs="Arial" w:eastAsia="Arial" w:hAnsi="Arial"/>
+          <w:sz w:val="24"/>
+          <w:szCs w:val="24"/>
+        </w:rPr>
+        <w:t xml:space="preserve">ZUBOFF, Shoshana. A era do capitalismo de vigilância: a luta por um futuro humano na nova fronteira do poder. Rio de Janeiro: Intrínseca, 2021.</w:t>
       </w:r>
     </w:p>
     <w:sectPr>

</xml_diff>

<commit_message>
Correct the reference list to ABNT NBR 6023
- Italicises only the title element of each entry, leaving subtitles
  roman, and moves the emphasis in the journal article from the article
  title to the periodical name.
- Replaces the LGPD placeholder summary with the law's actual ementa.
- Drops the duplicated publisher in the CONANDA entry and adds the
  co-publisher missing from the Jonas entry.
- Reformats the DOI so the identifier and the retrieval URL are separate
  fields.
- Adds the producer credit to the film entry.
- Moves every access date to 7 Aug 2026.

Co-Authored-By: Claude Fable 5 <noreply@anthropic.com>
Claude-Session: https://claude.ai/code/session_01VWDqYbQGufqqLk11LtZw9Q
</commit_message>
<xml_diff>
--- a/kelita_resenha_criança.docx
+++ b/kelita_resenha_criança.docx
@@ -131,7 +131,6 @@
     <w:p>
       <w:pPr>
         <w:spacing w:after="0" w:line="360"/>
-        <w:ind w:firstLine="0"/>
         <w:jc w:val="both"/>
       </w:pPr>
       <w:r>
@@ -140,7 +139,25 @@
           <w:sz w:val="24"/>
           <w:szCs w:val="24"/>
         </w:rPr>
-        <w:t xml:space="preserve">RENNER, Estela. Criança, a alma do negócio. São Paulo: Maria Farinha Filmes, 2008. 1 vídeo (49 min), son., color. Disponível em: https://www.youtube.com/watch?v=ur9lIf4RaZ4. Acesso em: 9 ago. 2026.</w:t>
+        <w:t xml:space="preserve">RENNER, Estela. </w:t>
+      </w:r>
+      <w:r>
+        <w:rPr>
+          <w:rFonts w:ascii="Arial" w:cs="Arial" w:eastAsia="Arial" w:hAnsi="Arial"/>
+          <w:i/>
+          <w:iCs/>
+          <w:sz w:val="24"/>
+          <w:szCs w:val="24"/>
+        </w:rPr>
+        <w:t xml:space="preserve">Criança, a alma do negócio</w:t>
+      </w:r>
+      <w:r>
+        <w:rPr>
+          <w:rFonts w:ascii="Arial" w:cs="Arial" w:eastAsia="Arial" w:hAnsi="Arial"/>
+          <w:sz w:val="24"/>
+          <w:szCs w:val="24"/>
+        </w:rPr>
+        <w:t xml:space="preserve">. Produção de Marcos Nisti. São Paulo: Maria Farinha Filmes, 2008. 1 vídeo (49 min), son., color. Disponível em: https://www.youtube.com/watch?v=ur9lIf4RaZ4. Acesso em: 7 ago. 2026.</w:t>
       </w:r>
     </w:p>
     <w:p>
@@ -300,150 +317,304 @@
       <w:r>
         <w:rPr>
           <w:rFonts w:ascii="Arial" w:cs="Arial" w:eastAsia="Arial" w:hAnsi="Arial"/>
-          <w:sz w:val="24"/>
-          <w:szCs w:val="24"/>
-        </w:rPr>
-        <w:t xml:space="preserve">BAUMAN, Zygmunt. Vida para consumo: a transformação das pessoas em mercadoria. Rio de Janeiro: Zahar, 2008.</w:t>
-      </w:r>
-    </w:p>
-    <w:p>
-      <w:pPr>
-        <w:spacing w:after="240" w:line="240"/>
-        <w:jc w:val="left"/>
-      </w:pPr>
-      <w:r>
-        <w:rPr>
-          <w:rFonts w:ascii="Arial" w:cs="Arial" w:eastAsia="Arial" w:hAnsi="Arial"/>
-          <w:sz w:val="24"/>
-          <w:szCs w:val="24"/>
-        </w:rPr>
-        <w:t xml:space="preserve">BRASIL. [Constituição (1988)]. Constituição da República Federativa do Brasil de 1988. Brasília, DF: Presidência da República, 1988. Disponível em: https://www.planalto.gov.br/ccivil_03/constituicao/constituicao.htm. Acesso em: 9 ago. 2026.</w:t>
-      </w:r>
-    </w:p>
-    <w:p>
-      <w:pPr>
-        <w:spacing w:after="240" w:line="240"/>
-        <w:jc w:val="left"/>
-      </w:pPr>
-      <w:r>
-        <w:rPr>
-          <w:rFonts w:ascii="Arial" w:cs="Arial" w:eastAsia="Arial" w:hAnsi="Arial"/>
-          <w:sz w:val="24"/>
-          <w:szCs w:val="24"/>
-        </w:rPr>
-        <w:t xml:space="preserve">BRASIL. Lei nº 8.078, de 11 de setembro de 1990. Dispõe sobre a proteção do consumidor e dá outras providências. Brasília, DF: Presidência da República, 1990. Disponível em: https://www.planalto.gov.br/ccivil_03/leis/l8078compilado.htm. Acesso em: 9 ago. 2026.</w:t>
-      </w:r>
-    </w:p>
-    <w:p>
-      <w:pPr>
-        <w:spacing w:after="240" w:line="240"/>
-        <w:jc w:val="left"/>
-      </w:pPr>
-      <w:r>
-        <w:rPr>
-          <w:rFonts w:ascii="Arial" w:cs="Arial" w:eastAsia="Arial" w:hAnsi="Arial"/>
-          <w:sz w:val="24"/>
-          <w:szCs w:val="24"/>
-        </w:rPr>
-        <w:t xml:space="preserve">BRASIL. Lei nº 13.709, de 14 de agosto de 2018. Lei Geral de Proteção de Dados Pessoais (LGPD). Brasília, DF: Presidência da República, 2018. Disponível em: https://www.planalto.gov.br/ccivil_03/_ato2015-2018/2018/lei/l13709.htm. Acesso em: 9 ago. 2026.</w:t>
-      </w:r>
-    </w:p>
-    <w:p>
-      <w:pPr>
-        <w:spacing w:after="240" w:line="240"/>
-        <w:jc w:val="left"/>
-      </w:pPr>
-      <w:r>
-        <w:rPr>
-          <w:rFonts w:ascii="Arial" w:cs="Arial" w:eastAsia="Arial" w:hAnsi="Arial"/>
-          <w:sz w:val="24"/>
-          <w:szCs w:val="24"/>
-        </w:rPr>
-        <w:t xml:space="preserve">BRASIL. Lei nº 15.211, de 17 de setembro de 2025. Institui o Estatuto Digital da Criança e do Adolescente. Brasília, DF: Presidência da República, 2025. Disponível em: https://www.planalto.gov.br/ccivil_03/_ato2023-2026/2025/lei/L15211.htm. Acesso em: 9 ago. 2026.</w:t>
-      </w:r>
-    </w:p>
-    <w:p>
-      <w:pPr>
-        <w:spacing w:after="240" w:line="240"/>
-        <w:jc w:val="left"/>
-      </w:pPr>
-      <w:r>
-        <w:rPr>
-          <w:rFonts w:ascii="Arial" w:cs="Arial" w:eastAsia="Arial" w:hAnsi="Arial"/>
-          <w:sz w:val="24"/>
-          <w:szCs w:val="24"/>
-        </w:rPr>
-        <w:t xml:space="preserve">CONANDA. Resolução nº 163, de 13 de março de 2014. Dispõe sobre a abusividade do direcionamento de publicidade e de comunicação mercadológica à criança e ao adolescente. Brasília, DF: Conselho Nacional dos Direitos da Criança e do Adolescente, 2014. Disponível em: https://www.gov.br/mdh/pt-br/acesso-a-informacao/participacao-social/conselho-nacional-dos-direitos-da-crianca-e-do-adolescente-conanda/resolucoes/resolucao-163-_publicidade-infantil.pdf. Acesso em: 9 ago. 2026.</w:t>
-      </w:r>
-    </w:p>
-    <w:p>
-      <w:pPr>
-        <w:spacing w:after="240" w:line="240"/>
-        <w:jc w:val="left"/>
-      </w:pPr>
-      <w:r>
-        <w:rPr>
-          <w:rFonts w:ascii="Arial" w:cs="Arial" w:eastAsia="Arial" w:hAnsi="Arial"/>
-          <w:sz w:val="24"/>
-          <w:szCs w:val="24"/>
-        </w:rPr>
-        <w:t xml:space="preserve">JONAS, Hans. O princípio responsabilidade: ensaio de uma ética para a civilização tecnológica. Rio de Janeiro: Contraponto, 2006.</w:t>
-      </w:r>
-    </w:p>
-    <w:p>
-      <w:pPr>
-        <w:spacing w:after="240" w:line="240"/>
-        <w:jc w:val="left"/>
-      </w:pPr>
-      <w:r>
-        <w:rPr>
-          <w:rFonts w:ascii="Arial" w:cs="Arial" w:eastAsia="Arial" w:hAnsi="Arial"/>
-          <w:sz w:val="24"/>
-          <w:szCs w:val="24"/>
-        </w:rPr>
-        <w:t xml:space="preserve">KANT, Immanuel. Fundamentação da metafísica dos costumes. São Paulo: Barcarolla, 2009.</w:t>
-      </w:r>
-    </w:p>
-    <w:p>
-      <w:pPr>
-        <w:spacing w:after="240" w:line="240"/>
-        <w:jc w:val="left"/>
-      </w:pPr>
-      <w:r>
-        <w:rPr>
-          <w:rFonts w:ascii="Arial" w:cs="Arial" w:eastAsia="Arial" w:hAnsi="Arial"/>
-          <w:sz w:val="24"/>
-          <w:szCs w:val="24"/>
-        </w:rPr>
-        <w:t xml:space="preserve">MATOS, J. P.; GONDO, M.; MOTA, L. S. E.; HORTA, P. M. Publicidade de alimentos direcionada à criança e ao adolescente no Brasil: análise longitudinal de denúncias no CONAR. Ciência &amp; Saúde Coletiva, v. 28, n. 7, p. 1959-1970, 2023. DOI: https://doi.org/10.1590/1413-81232023287.14752022. Acesso em: 9 ago. 2026.</w:t>
-      </w:r>
-    </w:p>
-    <w:p>
-      <w:pPr>
-        <w:spacing w:after="240" w:line="240"/>
-        <w:jc w:val="left"/>
-      </w:pPr>
-      <w:r>
-        <w:rPr>
-          <w:rFonts w:ascii="Arial" w:cs="Arial" w:eastAsia="Arial" w:hAnsi="Arial"/>
-          <w:sz w:val="24"/>
-          <w:szCs w:val="24"/>
-        </w:rPr>
-        <w:t xml:space="preserve">RENNER, Estela. Criança, a alma do negócio. São Paulo: Maria Farinha Filmes, 2008. 1 vídeo (49 min), son., color. Disponível em: https://www.youtube.com/watch?v=ur9lIf4RaZ4. Acesso em: 9 ago. 2026.</w:t>
-      </w:r>
-    </w:p>
-    <w:p>
-      <w:pPr>
-        <w:spacing w:after="240" w:line="240"/>
-        <w:jc w:val="left"/>
-      </w:pPr>
-      <w:r>
-        <w:rPr>
-          <w:rFonts w:ascii="Arial" w:cs="Arial" w:eastAsia="Arial" w:hAnsi="Arial"/>
-          <w:sz w:val="24"/>
-          <w:szCs w:val="24"/>
-        </w:rPr>
-        <w:t xml:space="preserve">ZUBOFF, Shoshana. A era do capitalismo de vigilância: a luta por um futuro humano na nova fronteira do poder. Rio de Janeiro: Intrínseca, 2021.</w:t>
+          <w:i w:val="false"/>
+          <w:iCs w:val="false"/>
+          <w:sz w:val="24"/>
+          <w:szCs w:val="24"/>
+        </w:rPr>
+        <w:t xml:space="preserve">BAUMAN, Zygmunt. </w:t>
+      </w:r>
+      <w:r>
+        <w:rPr>
+          <w:rFonts w:ascii="Arial" w:cs="Arial" w:eastAsia="Arial" w:hAnsi="Arial"/>
+          <w:i/>
+          <w:iCs/>
+          <w:sz w:val="24"/>
+          <w:szCs w:val="24"/>
+        </w:rPr>
+        <w:t xml:space="preserve">Vida para consumo</w:t>
+      </w:r>
+      <w:r>
+        <w:rPr>
+          <w:rFonts w:ascii="Arial" w:cs="Arial" w:eastAsia="Arial" w:hAnsi="Arial"/>
+          <w:i w:val="false"/>
+          <w:iCs w:val="false"/>
+          <w:sz w:val="24"/>
+          <w:szCs w:val="24"/>
+        </w:rPr>
+        <w:t xml:space="preserve">: a transformação das pessoas em mercadoria. Rio de Janeiro: Zahar, 2008.</w:t>
+      </w:r>
+    </w:p>
+    <w:p>
+      <w:pPr>
+        <w:spacing w:after="240" w:line="240"/>
+        <w:jc w:val="left"/>
+      </w:pPr>
+      <w:r>
+        <w:rPr>
+          <w:rFonts w:ascii="Arial" w:cs="Arial" w:eastAsia="Arial" w:hAnsi="Arial"/>
+          <w:i w:val="false"/>
+          <w:iCs w:val="false"/>
+          <w:sz w:val="24"/>
+          <w:szCs w:val="24"/>
+        </w:rPr>
+        <w:t xml:space="preserve">BRASIL. [Constituição (1988)]. </w:t>
+      </w:r>
+      <w:r>
+        <w:rPr>
+          <w:rFonts w:ascii="Arial" w:cs="Arial" w:eastAsia="Arial" w:hAnsi="Arial"/>
+          <w:i/>
+          <w:iCs/>
+          <w:sz w:val="24"/>
+          <w:szCs w:val="24"/>
+        </w:rPr>
+        <w:t xml:space="preserve">Constituição da República Federativa do Brasil de 1988</w:t>
+      </w:r>
+      <w:r>
+        <w:rPr>
+          <w:rFonts w:ascii="Arial" w:cs="Arial" w:eastAsia="Arial" w:hAnsi="Arial"/>
+          <w:i w:val="false"/>
+          <w:iCs w:val="false"/>
+          <w:sz w:val="24"/>
+          <w:szCs w:val="24"/>
+        </w:rPr>
+        <w:t xml:space="preserve">. Brasília, DF: Presidência da República, 1988. Disponível em: https://www.planalto.gov.br/ccivil_03/constituicao/constituicao.htm. Acesso em: 7 ago. 2026.</w:t>
+      </w:r>
+    </w:p>
+    <w:p>
+      <w:pPr>
+        <w:spacing w:after="240" w:line="240"/>
+        <w:jc w:val="left"/>
+      </w:pPr>
+      <w:r>
+        <w:rPr>
+          <w:rFonts w:ascii="Arial" w:cs="Arial" w:eastAsia="Arial" w:hAnsi="Arial"/>
+          <w:sz w:val="24"/>
+          <w:szCs w:val="24"/>
+        </w:rPr>
+        <w:t xml:space="preserve">BRASIL. Lei nº 8.078, de 11 de setembro de 1990. Dispõe sobre a proteção do consumidor e dá outras providências. Brasília, DF: Presidência da República, 1990. Disponível em: https://www.planalto.gov.br/ccivil_03/leis/l8078compilado.htm. Acesso em: 7 ago. 2026.</w:t>
+      </w:r>
+    </w:p>
+    <w:p>
+      <w:pPr>
+        <w:spacing w:after="240" w:line="240"/>
+        <w:jc w:val="left"/>
+      </w:pPr>
+      <w:r>
+        <w:rPr>
+          <w:rFonts w:ascii="Arial" w:cs="Arial" w:eastAsia="Arial" w:hAnsi="Arial"/>
+          <w:sz w:val="24"/>
+          <w:szCs w:val="24"/>
+        </w:rPr>
+        <w:t xml:space="preserve">BRASIL. Lei nº 13.709, de 14 de agosto de 2018. Dispõe sobre o tratamento de dados pessoais e altera a Lei nº 12.965, de 23 de abril de 2014 (Marco Civil da Internet). Brasília, DF: Presidência da República, 2018. Disponível em: https://www.planalto.gov.br/ccivil_03/_ato2015-2018/2018/lei/l13709.htm. Acesso em: 7 ago. 2026.</w:t>
+      </w:r>
+    </w:p>
+    <w:p>
+      <w:pPr>
+        <w:spacing w:after="240" w:line="240"/>
+        <w:jc w:val="left"/>
+      </w:pPr>
+      <w:r>
+        <w:rPr>
+          <w:rFonts w:ascii="Arial" w:cs="Arial" w:eastAsia="Arial" w:hAnsi="Arial"/>
+          <w:sz w:val="24"/>
+          <w:szCs w:val="24"/>
+        </w:rPr>
+        <w:t xml:space="preserve">BRASIL. Lei nº 15.211, de 17 de setembro de 2025. Institui o Estatuto Digital da Criança e do Adolescente. Brasília, DF: Presidência da República, 2025. Disponível em: https://www.planalto.gov.br/ccivil_03/_ato2023-2026/2025/lei/L15211.htm. Acesso em: 7 ago. 2026.</w:t>
+      </w:r>
+    </w:p>
+    <w:p>
+      <w:pPr>
+        <w:spacing w:after="240" w:line="240"/>
+        <w:jc w:val="left"/>
+      </w:pPr>
+      <w:r>
+        <w:rPr>
+          <w:rFonts w:ascii="Arial" w:cs="Arial" w:eastAsia="Arial" w:hAnsi="Arial"/>
+          <w:sz w:val="24"/>
+          <w:szCs w:val="24"/>
+        </w:rPr>
+        <w:t xml:space="preserve">CONANDA. Resolução nº 163, de 13 de março de 2014. Dispõe sobre a abusividade do direcionamento de publicidade e de comunicação mercadológica à criança e ao adolescente. Brasília, DF: CONANDA, 2014. Disponível em: https://www.gov.br/mdh/pt-br/acesso-a-informacao/participacao-social/conselho-nacional-dos-direitos-da-crianca-e-do-adolescente-conanda/resolucoes/resolucao-163-_publicidade-infantil.pdf. Acesso em: 7 ago. 2026.</w:t>
+      </w:r>
+    </w:p>
+    <w:p>
+      <w:pPr>
+        <w:spacing w:after="240" w:line="240"/>
+        <w:jc w:val="left"/>
+      </w:pPr>
+      <w:r>
+        <w:rPr>
+          <w:rFonts w:ascii="Arial" w:cs="Arial" w:eastAsia="Arial" w:hAnsi="Arial"/>
+          <w:i w:val="false"/>
+          <w:iCs w:val="false"/>
+          <w:sz w:val="24"/>
+          <w:szCs w:val="24"/>
+        </w:rPr>
+        <w:t xml:space="preserve">JONAS, Hans. </w:t>
+      </w:r>
+      <w:r>
+        <w:rPr>
+          <w:rFonts w:ascii="Arial" w:cs="Arial" w:eastAsia="Arial" w:hAnsi="Arial"/>
+          <w:i/>
+          <w:iCs/>
+          <w:sz w:val="24"/>
+          <w:szCs w:val="24"/>
+        </w:rPr>
+        <w:t xml:space="preserve">O princípio responsabilidade</w:t>
+      </w:r>
+      <w:r>
+        <w:rPr>
+          <w:rFonts w:ascii="Arial" w:cs="Arial" w:eastAsia="Arial" w:hAnsi="Arial"/>
+          <w:i w:val="false"/>
+          <w:iCs w:val="false"/>
+          <w:sz w:val="24"/>
+          <w:szCs w:val="24"/>
+        </w:rPr>
+        <w:t xml:space="preserve">: ensaio de uma ética para a civilização tecnológica. Rio de Janeiro: Contraponto: Ed. PUC-Rio, 2006.</w:t>
+      </w:r>
+    </w:p>
+    <w:p>
+      <w:pPr>
+        <w:spacing w:after="240" w:line="240"/>
+        <w:jc w:val="left"/>
+      </w:pPr>
+      <w:r>
+        <w:rPr>
+          <w:rFonts w:ascii="Arial" w:cs="Arial" w:eastAsia="Arial" w:hAnsi="Arial"/>
+          <w:i w:val="false"/>
+          <w:iCs w:val="false"/>
+          <w:sz w:val="24"/>
+          <w:szCs w:val="24"/>
+        </w:rPr>
+        <w:t xml:space="preserve">KANT, Immanuel. </w:t>
+      </w:r>
+      <w:r>
+        <w:rPr>
+          <w:rFonts w:ascii="Arial" w:cs="Arial" w:eastAsia="Arial" w:hAnsi="Arial"/>
+          <w:i/>
+          <w:iCs/>
+          <w:sz w:val="24"/>
+          <w:szCs w:val="24"/>
+        </w:rPr>
+        <w:t xml:space="preserve">Fundamentação da metafísica dos costumes</w:t>
+      </w:r>
+      <w:r>
+        <w:rPr>
+          <w:rFonts w:ascii="Arial" w:cs="Arial" w:eastAsia="Arial" w:hAnsi="Arial"/>
+          <w:i w:val="false"/>
+          <w:iCs w:val="false"/>
+          <w:sz w:val="24"/>
+          <w:szCs w:val="24"/>
+        </w:rPr>
+        <w:t xml:space="preserve">. São Paulo: Barcarolla, 2009.</w:t>
+      </w:r>
+    </w:p>
+    <w:p>
+      <w:pPr>
+        <w:spacing w:after="240" w:line="240"/>
+        <w:jc w:val="left"/>
+      </w:pPr>
+      <w:r>
+        <w:rPr>
+          <w:rFonts w:ascii="Arial" w:cs="Arial" w:eastAsia="Arial" w:hAnsi="Arial"/>
+          <w:i w:val="false"/>
+          <w:iCs w:val="false"/>
+          <w:sz w:val="24"/>
+          <w:szCs w:val="24"/>
+        </w:rPr>
+        <w:t xml:space="preserve">MATOS, J. P.; GONDO, M.; MOTA, L. S. E.; HORTA, P. M. Publicidade de alimentos direcionada à criança e ao adolescente no Brasil: análise longitudinal de denúncias no CONAR. </w:t>
+      </w:r>
+      <w:r>
+        <w:rPr>
+          <w:rFonts w:ascii="Arial" w:cs="Arial" w:eastAsia="Arial" w:hAnsi="Arial"/>
+          <w:i/>
+          <w:iCs/>
+          <w:sz w:val="24"/>
+          <w:szCs w:val="24"/>
+        </w:rPr>
+        <w:t xml:space="preserve">Ciência &amp; Saúde Coletiva</w:t>
+      </w:r>
+      <w:r>
+        <w:rPr>
+          <w:rFonts w:ascii="Arial" w:cs="Arial" w:eastAsia="Arial" w:hAnsi="Arial"/>
+          <w:i w:val="false"/>
+          <w:iCs w:val="false"/>
+          <w:sz w:val="24"/>
+          <w:szCs w:val="24"/>
+        </w:rPr>
+        <w:t xml:space="preserve">, Rio de Janeiro, v. 28, n. 7, p. 1959-1970, jul. 2023. DOI: 10.1590/1413-81232023287.14752022. Disponível em: https://doi.org/10.1590/1413-81232023287.14752022. Acesso em: 7 ago. 2026.</w:t>
+      </w:r>
+    </w:p>
+    <w:p>
+      <w:pPr>
+        <w:spacing w:after="240" w:line="240"/>
+        <w:jc w:val="left"/>
+      </w:pPr>
+      <w:r>
+        <w:rPr>
+          <w:rFonts w:ascii="Arial" w:cs="Arial" w:eastAsia="Arial" w:hAnsi="Arial"/>
+          <w:i w:val="false"/>
+          <w:iCs w:val="false"/>
+          <w:sz w:val="24"/>
+          <w:szCs w:val="24"/>
+        </w:rPr>
+        <w:t xml:space="preserve">RENNER, Estela. </w:t>
+      </w:r>
+      <w:r>
+        <w:rPr>
+          <w:rFonts w:ascii="Arial" w:cs="Arial" w:eastAsia="Arial" w:hAnsi="Arial"/>
+          <w:i/>
+          <w:iCs/>
+          <w:sz w:val="24"/>
+          <w:szCs w:val="24"/>
+        </w:rPr>
+        <w:t xml:space="preserve">Criança, a alma do negócio</w:t>
+      </w:r>
+      <w:r>
+        <w:rPr>
+          <w:rFonts w:ascii="Arial" w:cs="Arial" w:eastAsia="Arial" w:hAnsi="Arial"/>
+          <w:i w:val="false"/>
+          <w:iCs w:val="false"/>
+          <w:sz w:val="24"/>
+          <w:szCs w:val="24"/>
+        </w:rPr>
+        <w:t xml:space="preserve">. Produção de Marcos Nisti. São Paulo: Maria Farinha Filmes, 2008. 1 vídeo (49 min), son., color. Disponível em: https://www.youtube.com/watch?v=ur9lIf4RaZ4. Acesso em: 7 ago. 2026.</w:t>
+      </w:r>
+    </w:p>
+    <w:p>
+      <w:pPr>
+        <w:spacing w:after="240" w:line="240"/>
+        <w:jc w:val="left"/>
+      </w:pPr>
+      <w:r>
+        <w:rPr>
+          <w:rFonts w:ascii="Arial" w:cs="Arial" w:eastAsia="Arial" w:hAnsi="Arial"/>
+          <w:i w:val="false"/>
+          <w:iCs w:val="false"/>
+          <w:sz w:val="24"/>
+          <w:szCs w:val="24"/>
+        </w:rPr>
+        <w:t xml:space="preserve">ZUBOFF, Shoshana. </w:t>
+      </w:r>
+      <w:r>
+        <w:rPr>
+          <w:rFonts w:ascii="Arial" w:cs="Arial" w:eastAsia="Arial" w:hAnsi="Arial"/>
+          <w:i/>
+          <w:iCs/>
+          <w:sz w:val="24"/>
+          <w:szCs w:val="24"/>
+        </w:rPr>
+        <w:t xml:space="preserve">A era do capitalismo de vigilância</w:t>
+      </w:r>
+      <w:r>
+        <w:rPr>
+          <w:rFonts w:ascii="Arial" w:cs="Arial" w:eastAsia="Arial" w:hAnsi="Arial"/>
+          <w:i w:val="false"/>
+          <w:iCs w:val="false"/>
+          <w:sz w:val="24"/>
+          <w:szCs w:val="24"/>
+        </w:rPr>
+        <w:t xml:space="preserve">: a luta por um futuro humano na nova fronteira do poder. Rio de Janeiro: Intrínseca, 2021.</w:t>
       </w:r>
     </w:p>
     <w:sectPr>

</xml_diff>

<commit_message>
Source the director's biography
Adds the Projeto Draft profile as the reference behind the opening
paragraph, which until now made biographical claims that appear nowhere
in the reviewed film and carried no source. Places the entry between
MATOS and RENNER and anchors it with an in-text citation at the end of
the paragraph.

Co-Authored-By: Claude Fable 5 <noreply@anthropic.com>
Claude-Session: https://claude.ai/code/session_01VWDqYbQGufqqLk11LtZw9Q
</commit_message>
<xml_diff>
--- a/kelita_resenha_criança.docx
+++ b/kelita_resenha_criança.docx
@@ -377,7 +377,7 @@
           <w:szCs w:val="24"/>
           <w:rtl w:val="0"/>
         </w:rPr>
-        <w:t xml:space="preserve">. Seus dois primeiros documentários foram vistos por mais de dois milhões de pessoas e alimentaram o debate público sobre a regulação da publicidade dirigida a crianças.</w:t>
+        <w:t xml:space="preserve">. Seus dois primeiros documentários foram vistos por mais de dois milhões de pessoas e alimentaram o debate público sobre a regulação da publicidade dirigida a crianças (MAZZOLA, 2015).</w:t>
       </w:r>
       <w:r>
         <w:rPr>
@@ -1078,6 +1078,42 @@
           <w:rtl w:val="0"/>
         </w:rPr>
         <w:t xml:space="preserve">, Rio de Janeiro, v. 28, n. 7, p. 1959-1970, jul. 2023. DOI: 10.1590/1413-81232023287.14752022. Disponível em: https://doi.org/10.1590/1413-81232023287.14752022. Acesso em: 7 ago. 2026.</w:t>
+      </w:r>
+    </w:p>
+    <w:p>
+      <w:pPr>
+        <w:spacing w:after="0" w:line="240" w:lineRule="auto"/>
+        <w:jc w:val="left"/>
+        <w:rPr/>
+      </w:pPr>
+      <w:r>
+        <w:rPr>
+          <w:rFonts w:ascii="Arial" w:cs="Arial" w:eastAsia="Arial" w:hAnsi="Arial"/>
+          <w:sz w:val="24"/>
+          <w:szCs w:val="24"/>
+          <w:rtl w:val="0"/>
+        </w:rPr>
+        <w:t xml:space="preserve">MAZZOLA, Mirela. A câmera como porta-voz das causas da infância: conheça Estela Renner, da Maria Farinha Filmes. </w:t>
+      </w:r>
+      <w:r>
+        <w:rPr>
+          <w:rFonts w:ascii="Arial" w:cs="Arial" w:eastAsia="Arial" w:hAnsi="Arial"/>
+          <w:i/>
+          <w:iCs/>
+          <w:sz w:val="24"/>
+          <w:szCs w:val="24"/>
+          <w:rtl w:val="0"/>
+        </w:rPr>
+        <w:t xml:space="preserve">Projeto Draft</w:t>
+      </w:r>
+      <w:r>
+        <w:rPr>
+          <w:rFonts w:ascii="Arial" w:cs="Arial" w:eastAsia="Arial" w:hAnsi="Arial"/>
+          <w:sz w:val="24"/>
+          <w:szCs w:val="24"/>
+          <w:rtl w:val="0"/>
+        </w:rPr>
+        <w:t xml:space="preserve">, São Paulo, 29 abr. 2015. Disponível em: https://www.projetodraft.com/a-camera-como-porta-voz-das-causas-da-infancia-conheca-estela-renner-da-maria-farinha-filmes/. Acesso em: 7 ago. 2026.</w:t>
       </w:r>
     </w:p>
     <w:p>

</xml_diff>